<commit_message>
Update document titles and regenerate corrupted files
Update metadata for newly generated, valid DOCX files and revert to a stable version of the docx library to resolve corruption issues.

Replit-Commit-Author: Agent
Replit-Commit-Session-Id: 5c94e607-5be3-455f-8aba-fdede5633b38
Replit-Commit-Checkpoint-Type: full_checkpoint
Replit-Commit-Event-Id: 270b3219-ee5e-466a-b69d-11ede8d53e84
Replit-Commit-Screenshot-Url: https://storage.googleapis.com/screenshot-production-us-central1/2e2f5a8d-1ac5-4f2d-9bb6-6f165d8b8e98/5c94e607-5be3-455f-8aba-fdede5633b38/MybVWBW
Replit-Helium-Checkpoint-Created: true
</commit_message>
<xml_diff>
--- a/MiKa_Anleitung_Verwaltung_Admin.docx
+++ b/MiKa_Anleitung_Verwaltung_Admin.docx
@@ -16,9 +16,9 @@
       </w:pPr>
       <w:r>
         <w:rPr>
-          <w:rFonts w:ascii="Segoe UI Emoji" w:cs="Segoe UI Emoji" w:eastAsia="Segoe UI Emoji" w:hAnsi="Segoe UI Emoji"/>
           <w:sz w:val="80"/>
           <w:szCs w:val="80"/>
+          <w:rFonts w:ascii="Segoe UI Emoji" w:cs="Segoe UI Emoji" w:eastAsia="Segoe UI Emoji" w:hAnsi="Segoe UI Emoji"/>
         </w:rPr>
         <w:t xml:space="preserve">⚙️</w:t>
       </w:r>
@@ -37,12 +37,12 @@
       </w:pPr>
       <w:r>
         <w:rPr>
-          <w:rFonts w:ascii="Arial" w:cs="Arial" w:eastAsia="Arial" w:hAnsi="Arial"/>
           <w:b/>
           <w:bCs/>
           <w:color w:val="1a3a6b"/>
           <w:sz w:val="72"/>
           <w:szCs w:val="72"/>
+          <w:rFonts w:ascii="Arial" w:cs="Arial" w:eastAsia="Arial" w:hAnsi="Arial"/>
         </w:rPr>
         <w:t xml:space="preserve">MiKa</w:t>
       </w:r>
@@ -53,10 +53,10 @@
       </w:pPr>
       <w:r>
         <w:rPr>
-          <w:rFonts w:ascii="Arial" w:cs="Arial" w:eastAsia="Arial" w:hAnsi="Arial"/>
           <w:color w:val="6b7280"/>
           <w:sz w:val="28"/>
           <w:szCs w:val="28"/>
+          <w:rFonts w:ascii="Arial" w:cs="Arial" w:eastAsia="Arial" w:hAnsi="Arial"/>
         </w:rPr>
         <w:t xml:space="preserve">Anleitung für Verwaltung &amp; Administration</w:t>
       </w:r>
@@ -75,10 +75,10 @@
       </w:pPr>
       <w:r>
         <w:rPr>
-          <w:rFonts w:ascii="Arial" w:cs="Arial" w:eastAsia="Arial" w:hAnsi="Arial"/>
           <w:color w:val="6b7280"/>
           <w:sz w:val="22"/>
           <w:szCs w:val="22"/>
+          <w:rFonts w:ascii="Arial" w:cs="Arial" w:eastAsia="Arial" w:hAnsi="Arial"/>
         </w:rPr>
         <w:t xml:space="preserve">EDEKA DALLMANN  ·  Leeder · Buching · MOD</w:t>
       </w:r>
@@ -123,70 +123,70 @@
           </w:tcPr>
           <w:p>
             <w:pPr>
-              <w:spacing w:after="40" w:before="60"/>
+              <w:spacing w:before="60" w:after="40"/>
               <w:ind w:left="120"/>
             </w:pPr>
             <w:r>
               <w:rPr>
-                <w:rFonts w:ascii="Segoe UI Emoji" w:cs="Segoe UI Emoji" w:eastAsia="Segoe UI Emoji" w:hAnsi="Segoe UI Emoji"/>
                 <w:sz w:val="22"/>
                 <w:szCs w:val="22"/>
+                <w:rFonts w:ascii="Segoe UI Emoji" w:cs="Segoe UI Emoji" w:eastAsia="Segoe UI Emoji" w:hAnsi="Segoe UI Emoji"/>
               </w:rPr>
               <w:t xml:space="preserve">💡  </w:t>
             </w:r>
             <w:r>
               <w:rPr>
-                <w:rFonts w:ascii="Arial" w:cs="Arial" w:eastAsia="Arial" w:hAnsi="Arial"/>
                 <w:b/>
                 <w:bCs/>
                 <w:color w:val="1a3a6b"/>
                 <w:sz w:val="22"/>
                 <w:szCs w:val="22"/>
+                <w:rFonts w:ascii="Arial" w:cs="Arial" w:eastAsia="Arial" w:hAnsi="Arial"/>
               </w:rPr>
               <w:t xml:space="preserve">Für wen ist diese Anleitung?</w:t>
             </w:r>
           </w:p>
           <w:p>
             <w:pPr>
-              <w:spacing w:after="30" w:before="0"/>
+              <w:spacing w:before="0" w:after="30"/>
               <w:ind w:left="200"/>
             </w:pPr>
             <w:r>
               <w:rPr>
-                <w:rFonts w:ascii="Arial" w:cs="Arial" w:eastAsia="Arial" w:hAnsi="Arial"/>
                 <w:color w:val="111827"/>
                 <w:sz w:val="21"/>
                 <w:szCs w:val="21"/>
+                <w:rFonts w:ascii="Arial" w:cs="Arial" w:eastAsia="Arial" w:hAnsi="Arial"/>
               </w:rPr>
               <w:t xml:space="preserve">Diese Anleitung richtet sich an Personen mit Verwaltungs- oder Admin-Zugang.</w:t>
             </w:r>
           </w:p>
           <w:p>
             <w:pPr>
-              <w:spacing w:after="30" w:before="0"/>
+              <w:spacing w:before="0" w:after="30"/>
               <w:ind w:left="200"/>
             </w:pPr>
             <w:r>
               <w:rPr>
-                <w:rFonts w:ascii="Arial" w:cs="Arial" w:eastAsia="Arial" w:hAnsi="Arial"/>
                 <w:color w:val="111827"/>
                 <w:sz w:val="21"/>
                 <w:szCs w:val="21"/>
+                <w:rFonts w:ascii="Arial" w:cs="Arial" w:eastAsia="Arial" w:hAnsi="Arial"/>
               </w:rPr>
               <w:t xml:space="preserve">Sie erklärt alle Funktionen des Systems – von der täglichen Nutzung bis zur</w:t>
             </w:r>
           </w:p>
           <w:p>
             <w:pPr>
-              <w:spacing w:after="30" w:before="0"/>
+              <w:spacing w:before="0" w:after="30"/>
               <w:ind w:left="200"/>
             </w:pPr>
             <w:r>
               <w:rPr>
-                <w:rFonts w:ascii="Arial" w:cs="Arial" w:eastAsia="Arial" w:hAnsi="Arial"/>
                 <w:color w:val="111827"/>
                 <w:sz w:val="21"/>
                 <w:szCs w:val="21"/>
+                <w:rFonts w:ascii="Arial" w:cs="Arial" w:eastAsia="Arial" w:hAnsi="Arial"/>
               </w:rPr>
               <w:t xml:space="preserve">Systemkonfiguration. Alles mit Screenshots und Schritt-für-Schritt-Anleitungen.</w:t>
             </w:r>
@@ -231,17 +231,17 @@
           </w:tcPr>
           <w:p>
             <w:pPr>
-              <w:spacing w:after="60" w:before="60"/>
+              <w:spacing w:before="60" w:after="60"/>
               <w:ind w:left="120"/>
             </w:pPr>
             <w:r>
               <w:rPr>
-                <w:rFonts w:ascii="Arial" w:cs="Arial" w:eastAsia="Arial" w:hAnsi="Arial"/>
                 <w:b/>
                 <w:bCs/>
                 <w:color w:val="FFFFFF"/>
                 <w:sz w:val="24"/>
                 <w:szCs w:val="24"/>
+                <w:rFonts w:ascii="Arial" w:cs="Arial" w:eastAsia="Arial" w:hAnsi="Arial"/>
               </w:rPr>
               <w:t xml:space="preserve">📑  Inhaltsübersicht</w:t>
             </w:r>
@@ -262,17 +262,17 @@
           </w:tcPr>
           <w:p>
             <w:pPr>
-              <w:spacing w:after="60" w:before="60"/>
+              <w:spacing w:before="60" w:after="60"/>
               <w:jc w:val="center"/>
             </w:pPr>
             <w:r>
               <w:rPr>
-                <w:rFonts w:ascii="Arial" w:cs="Arial" w:eastAsia="Arial" w:hAnsi="Arial"/>
                 <w:b/>
                 <w:bCs/>
                 <w:color w:val="2d5aa0"/>
                 <w:sz w:val="24"/>
                 <w:szCs w:val="24"/>
+                <w:rFonts w:ascii="Arial" w:cs="Arial" w:eastAsia="Arial" w:hAnsi="Arial"/>
               </w:rPr>
               <w:t xml:space="preserve">Teil A</w:t>
             </w:r>
@@ -291,32 +291,32 @@
           </w:tcPr>
           <w:p>
             <w:pPr>
-              <w:spacing w:after="20" w:before="40"/>
+              <w:spacing w:before="40" w:after="20"/>
               <w:ind w:left="80"/>
             </w:pPr>
             <w:r>
               <w:rPr>
-                <w:rFonts w:ascii="Arial" w:cs="Arial" w:eastAsia="Arial" w:hAnsi="Arial"/>
                 <w:b/>
                 <w:bCs/>
                 <w:color w:val="1a3a6b"/>
                 <w:sz w:val="22"/>
                 <w:szCs w:val="22"/>
+                <w:rFonts w:ascii="Arial" w:cs="Arial" w:eastAsia="Arial" w:hAnsi="Arial"/>
               </w:rPr>
               <w:t xml:space="preserve">Tägliche Aufgaben</w:t>
             </w:r>
           </w:p>
           <w:p>
             <w:pPr>
-              <w:spacing w:after="40" w:before="0"/>
+              <w:spacing w:before="0" w:after="40"/>
               <w:ind w:left="80"/>
             </w:pPr>
             <w:r>
               <w:rPr>
-                <w:rFonts w:ascii="Arial" w:cs="Arial" w:eastAsia="Arial" w:hAnsi="Arial"/>
                 <w:color w:val="6b7280"/>
                 <w:sz w:val="20"/>
                 <w:szCs w:val="20"/>
+                <w:rFonts w:ascii="Arial" w:cs="Arial" w:eastAsia="Arial" w:hAnsi="Arial"/>
               </w:rPr>
               <w:t xml:space="preserve">Wareneingänge, Reinigung, Temperaturen</w:t>
             </w:r>
@@ -337,17 +337,17 @@
           </w:tcPr>
           <w:p>
             <w:pPr>
-              <w:spacing w:after="60" w:before="60"/>
+              <w:spacing w:before="60" w:after="60"/>
               <w:jc w:val="center"/>
             </w:pPr>
             <w:r>
               <w:rPr>
-                <w:rFonts w:ascii="Arial" w:cs="Arial" w:eastAsia="Arial" w:hAnsi="Arial"/>
                 <w:b/>
                 <w:bCs/>
                 <w:color w:val="2d5aa0"/>
                 <w:sz w:val="24"/>
                 <w:szCs w:val="24"/>
+                <w:rFonts w:ascii="Arial" w:cs="Arial" w:eastAsia="Arial" w:hAnsi="Arial"/>
               </w:rPr>
               <w:t xml:space="preserve">Teil B</w:t>
             </w:r>
@@ -366,32 +366,32 @@
           </w:tcPr>
           <w:p>
             <w:pPr>
-              <w:spacing w:after="20" w:before="40"/>
+              <w:spacing w:before="40" w:after="20"/>
               <w:ind w:left="80"/>
             </w:pPr>
             <w:r>
               <w:rPr>
-                <w:rFonts w:ascii="Arial" w:cs="Arial" w:eastAsia="Arial" w:hAnsi="Arial"/>
                 <w:b/>
                 <w:bCs/>
                 <w:color w:val="1a3a6b"/>
                 <w:sz w:val="22"/>
                 <w:szCs w:val="22"/>
+                <w:rFonts w:ascii="Arial" w:cs="Arial" w:eastAsia="Arial" w:hAnsi="Arial"/>
               </w:rPr>
               <w:t xml:space="preserve">Verwaltungsfunktionen</w:t>
             </w:r>
           </w:p>
           <w:p>
             <w:pPr>
-              <w:spacing w:after="40" w:before="0"/>
+              <w:spacing w:before="0" w:after="40"/>
               <w:ind w:left="80"/>
             </w:pPr>
             <w:r>
               <w:rPr>
-                <w:rFonts w:ascii="Arial" w:cs="Arial" w:eastAsia="Arial" w:hAnsi="Arial"/>
                 <w:color w:val="6b7280"/>
                 <w:sz w:val="20"/>
                 <w:szCs w:val="20"/>
+                <w:rFonts w:ascii="Arial" w:cs="Arial" w:eastAsia="Arial" w:hAnsi="Arial"/>
               </w:rPr>
               <w:t xml:space="preserve">Mitarbeiter, Schulungen, Lieferanten, Berichte</w:t>
             </w:r>
@@ -412,17 +412,17 @@
           </w:tcPr>
           <w:p>
             <w:pPr>
-              <w:spacing w:after="60" w:before="60"/>
+              <w:spacing w:before="60" w:after="60"/>
               <w:jc w:val="center"/>
             </w:pPr>
             <w:r>
               <w:rPr>
-                <w:rFonts w:ascii="Arial" w:cs="Arial" w:eastAsia="Arial" w:hAnsi="Arial"/>
                 <w:b/>
                 <w:bCs/>
                 <w:color w:val="2d5aa0"/>
                 <w:sz w:val="24"/>
                 <w:szCs w:val="24"/>
+                <w:rFonts w:ascii="Arial" w:cs="Arial" w:eastAsia="Arial" w:hAnsi="Arial"/>
               </w:rPr>
               <w:t xml:space="preserve">Teil C</w:t>
             </w:r>
@@ -441,32 +441,32 @@
           </w:tcPr>
           <w:p>
             <w:pPr>
-              <w:spacing w:after="20" w:before="40"/>
+              <w:spacing w:before="40" w:after="20"/>
               <w:ind w:left="80"/>
             </w:pPr>
             <w:r>
               <w:rPr>
-                <w:rFonts w:ascii="Arial" w:cs="Arial" w:eastAsia="Arial" w:hAnsi="Arial"/>
                 <w:b/>
                 <w:bCs/>
                 <w:color w:val="1a3a6b"/>
                 <w:sz w:val="22"/>
                 <w:szCs w:val="22"/>
+                <w:rFonts w:ascii="Arial" w:cs="Arial" w:eastAsia="Arial" w:hAnsi="Arial"/>
               </w:rPr>
               <w:t xml:space="preserve">Systemadministration</w:t>
             </w:r>
           </w:p>
           <w:p>
             <w:pPr>
-              <w:spacing w:after="40" w:before="0"/>
+              <w:spacing w:before="0" w:after="40"/>
               <w:ind w:left="80"/>
             </w:pPr>
             <w:r>
               <w:rPr>
-                <w:rFonts w:ascii="Arial" w:cs="Arial" w:eastAsia="Arial" w:hAnsi="Arial"/>
                 <w:color w:val="6b7280"/>
                 <w:sz w:val="20"/>
                 <w:szCs w:val="20"/>
+                <w:rFonts w:ascii="Arial" w:cs="Arial" w:eastAsia="Arial" w:hAnsi="Arial"/>
               </w:rPr>
               <w:t xml:space="preserve">Benutzerverwaltung, Module, E-Mail, Sicherheit</w:t>
             </w:r>
@@ -487,17 +487,17 @@
           </w:tcPr>
           <w:p>
             <w:pPr>
-              <w:spacing w:after="60" w:before="60"/>
+              <w:spacing w:before="60" w:after="60"/>
               <w:jc w:val="center"/>
             </w:pPr>
             <w:r>
               <w:rPr>
-                <w:rFonts w:ascii="Arial" w:cs="Arial" w:eastAsia="Arial" w:hAnsi="Arial"/>
                 <w:b/>
                 <w:bCs/>
                 <w:color w:val="2d5aa0"/>
                 <w:sz w:val="24"/>
                 <w:szCs w:val="24"/>
+                <w:rFonts w:ascii="Arial" w:cs="Arial" w:eastAsia="Arial" w:hAnsi="Arial"/>
               </w:rPr>
               <w:t xml:space="preserve">Teil D</w:t>
             </w:r>
@@ -516,32 +516,32 @@
           </w:tcPr>
           <w:p>
             <w:pPr>
-              <w:spacing w:after="20" w:before="40"/>
+              <w:spacing w:before="40" w:after="20"/>
               <w:ind w:left="80"/>
             </w:pPr>
             <w:r>
               <w:rPr>
-                <w:rFonts w:ascii="Arial" w:cs="Arial" w:eastAsia="Arial" w:hAnsi="Arial"/>
                 <w:b/>
                 <w:bCs/>
                 <w:color w:val="1a3a6b"/>
                 <w:sz w:val="22"/>
                 <w:szCs w:val="22"/>
+                <w:rFonts w:ascii="Arial" w:cs="Arial" w:eastAsia="Arial" w:hAnsi="Arial"/>
               </w:rPr>
               <w:t xml:space="preserve">Tipps &amp; Sicherheitshinweise</w:t>
             </w:r>
           </w:p>
           <w:p>
             <w:pPr>
-              <w:spacing w:after="40" w:before="0"/>
+              <w:spacing w:before="0" w:after="40"/>
               <w:ind w:left="80"/>
             </w:pPr>
             <w:r>
               <w:rPr>
-                <w:rFonts w:ascii="Arial" w:cs="Arial" w:eastAsia="Arial" w:hAnsi="Arial"/>
                 <w:color w:val="6b7280"/>
                 <w:sz w:val="20"/>
                 <w:szCs w:val="20"/>
+                <w:rFonts w:ascii="Arial" w:cs="Arial" w:eastAsia="Arial" w:hAnsi="Arial"/>
               </w:rPr>
               <w:t xml:space="preserve">Master-Passwort, Backup, Behörden</w:t>
             </w:r>
@@ -568,25 +568,25 @@
           <w:bottom w:val="single" w:color="2d5aa0" w:sz="6"/>
         </w:pBdr>
         <w:shd w:color="1a3a6b" w:val="solid"/>
-        <w:spacing w:after="0" w:before="200"/>
+        <w:spacing w:before="200" w:after="0"/>
         <w:ind w:left="200" w:right="200"/>
       </w:pPr>
       <w:r>
         <w:rPr>
-          <w:rFonts w:ascii="Segoe UI Emoji" w:cs="Segoe UI Emoji" w:eastAsia="Segoe UI Emoji" w:hAnsi="Segoe UI Emoji"/>
           <w:sz w:val="32"/>
           <w:szCs w:val="32"/>
+          <w:rFonts w:ascii="Segoe UI Emoji" w:cs="Segoe UI Emoji" w:eastAsia="Segoe UI Emoji" w:hAnsi="Segoe UI Emoji"/>
         </w:rPr>
         <w:t xml:space="preserve">📋  </w:t>
       </w:r>
       <w:r>
         <w:rPr>
-          <w:rFonts w:ascii="Arial" w:cs="Arial" w:eastAsia="Arial" w:hAnsi="Arial"/>
           <w:b/>
           <w:bCs/>
           <w:color w:val="FFFFFF"/>
           <w:sz w:val="32"/>
           <w:szCs w:val="32"/>
+          <w:rFonts w:ascii="Arial" w:cs="Arial" w:eastAsia="Arial" w:hAnsi="Arial"/>
         </w:rPr>
         <w:t xml:space="preserve">Teil A  –  Tägliche Aufgaben</w:t>
       </w:r>
@@ -631,70 +631,70 @@
           </w:tcPr>
           <w:p>
             <w:pPr>
-              <w:spacing w:after="40" w:before="60"/>
+              <w:spacing w:before="60" w:after="40"/>
               <w:ind w:left="120"/>
             </w:pPr>
             <w:r>
               <w:rPr>
-                <w:rFonts w:ascii="Segoe UI Emoji" w:cs="Segoe UI Emoji" w:eastAsia="Segoe UI Emoji" w:hAnsi="Segoe UI Emoji"/>
                 <w:sz w:val="22"/>
                 <w:szCs w:val="22"/>
+                <w:rFonts w:ascii="Segoe UI Emoji" w:cs="Segoe UI Emoji" w:eastAsia="Segoe UI Emoji" w:hAnsi="Segoe UI Emoji"/>
               </w:rPr>
               <w:t xml:space="preserve">💡  </w:t>
             </w:r>
             <w:r>
               <w:rPr>
-                <w:rFonts w:ascii="Arial" w:cs="Arial" w:eastAsia="Arial" w:hAnsi="Arial"/>
                 <w:b/>
                 <w:bCs/>
                 <w:color w:val="1a3a6b"/>
                 <w:sz w:val="22"/>
                 <w:szCs w:val="22"/>
+                <w:rFonts w:ascii="Arial" w:cs="Arial" w:eastAsia="Arial" w:hAnsi="Arial"/>
               </w:rPr>
               <w:t xml:space="preserve">Kurzfassung</w:t>
             </w:r>
           </w:p>
           <w:p>
             <w:pPr>
-              <w:spacing w:after="30" w:before="0"/>
+              <w:spacing w:before="0" w:after="30"/>
               <w:ind w:left="200"/>
             </w:pPr>
             <w:r>
               <w:rPr>
-                <w:rFonts w:ascii="Arial" w:cs="Arial" w:eastAsia="Arial" w:hAnsi="Arial"/>
                 <w:color w:val="111827"/>
                 <w:sz w:val="21"/>
                 <w:szCs w:val="21"/>
+                <w:rFonts w:ascii="Arial" w:cs="Arial" w:eastAsia="Arial" w:hAnsi="Arial"/>
               </w:rPr>
               <w:t xml:space="preserve">Die täglichen Aufgaben in der Verwaltung sind dieselben wie für alle Mitarbeiter.</w:t>
             </w:r>
           </w:p>
           <w:p>
             <w:pPr>
-              <w:spacing w:after="30" w:before="0"/>
+              <w:spacing w:before="0" w:after="30"/>
               <w:ind w:left="200"/>
             </w:pPr>
             <w:r>
               <w:rPr>
-                <w:rFonts w:ascii="Arial" w:cs="Arial" w:eastAsia="Arial" w:hAnsi="Arial"/>
                 <w:color w:val="111827"/>
                 <w:sz w:val="21"/>
                 <w:szCs w:val="21"/>
+                <w:rFonts w:ascii="Arial" w:cs="Arial" w:eastAsia="Arial" w:hAnsi="Arial"/>
               </w:rPr>
               <w:t xml:space="preserve">Wareneingänge (2.1 und 3.1), Reinigung (2.3), Warencheck (2.2), Temperaturen (1.13).</w:t>
             </w:r>
           </w:p>
           <w:p>
             <w:pPr>
-              <w:spacing w:after="30" w:before="0"/>
+              <w:spacing w:before="0" w:after="30"/>
               <w:ind w:left="200"/>
             </w:pPr>
             <w:r>
               <w:rPr>
-                <w:rFonts w:ascii="Arial" w:cs="Arial" w:eastAsia="Arial" w:hAnsi="Arial"/>
                 <w:color w:val="111827"/>
                 <w:sz w:val="21"/>
                 <w:szCs w:val="21"/>
+                <w:rFonts w:ascii="Arial" w:cs="Arial" w:eastAsia="Arial" w:hAnsi="Arial"/>
               </w:rPr>
               <w:t xml:space="preserve">Details stehen in der Mitarbeiter-Kurzanleitung.</w:t>
             </w:r>
@@ -738,23 +738,23 @@
           </w:tcPr>
           <w:p>
             <w:pPr>
-              <w:spacing w:after="60" w:before="60"/>
+              <w:spacing w:before="60" w:after="60"/>
               <w:ind w:left="80"/>
             </w:pPr>
             <w:r>
               <w:rPr>
-                <w:rFonts w:ascii="Segoe UI Emoji" w:cs="Segoe UI Emoji" w:eastAsia="Segoe UI Emoji" w:hAnsi="Segoe UI Emoji"/>
                 <w:sz w:val="22"/>
                 <w:szCs w:val="22"/>
+                <w:rFonts w:ascii="Segoe UI Emoji" w:cs="Segoe UI Emoji" w:eastAsia="Segoe UI Emoji" w:hAnsi="Segoe UI Emoji"/>
               </w:rPr>
               <w:t xml:space="preserve">✅  </w:t>
             </w:r>
             <w:r>
               <w:rPr>
-                <w:rFonts w:ascii="Arial" w:cs="Arial" w:eastAsia="Arial" w:hAnsi="Arial"/>
                 <w:color w:val="111827"/>
                 <w:sz w:val="21"/>
                 <w:szCs w:val="21"/>
+                <w:rFonts w:ascii="Arial" w:cs="Arial" w:eastAsia="Arial" w:hAnsi="Arial"/>
               </w:rPr>
               <w:t xml:space="preserve">Als Verwaltung hast du zusätzlich Zugriff auf die Admin-Einstellungen (Zahnrad-Symbol oben rechts). Damit öffnest du alle Verwaltungsfunktionen.</w:t>
             </w:r>
@@ -781,25 +781,25 @@
           <w:bottom w:val="single" w:color="2d5aa0" w:sz="6"/>
         </w:pBdr>
         <w:shd w:color="1a3a6b" w:val="solid"/>
-        <w:spacing w:after="0" w:before="200"/>
+        <w:spacing w:before="200" w:after="0"/>
         <w:ind w:left="200" w:right="200"/>
       </w:pPr>
       <w:r>
         <w:rPr>
-          <w:rFonts w:ascii="Segoe UI Emoji" w:cs="Segoe UI Emoji" w:eastAsia="Segoe UI Emoji" w:hAnsi="Segoe UI Emoji"/>
           <w:sz w:val="32"/>
           <w:szCs w:val="32"/>
+          <w:rFonts w:ascii="Segoe UI Emoji" w:cs="Segoe UI Emoji" w:eastAsia="Segoe UI Emoji" w:hAnsi="Segoe UI Emoji"/>
         </w:rPr>
         <w:t xml:space="preserve">🗂️  </w:t>
       </w:r>
       <w:r>
         <w:rPr>
-          <w:rFonts w:ascii="Arial" w:cs="Arial" w:eastAsia="Arial" w:hAnsi="Arial"/>
           <w:b/>
           <w:bCs/>
           <w:color w:val="FFFFFF"/>
           <w:sz w:val="32"/>
           <w:szCs w:val="32"/>
+          <w:rFonts w:ascii="Arial" w:cs="Arial" w:eastAsia="Arial" w:hAnsi="Arial"/>
         </w:rPr>
         <w:t xml:space="preserve">Teil B  –  Verwaltungsfunktionen</w:t>
       </w:r>
@@ -815,25 +815,25 @@
     <w:p>
       <w:pPr>
         <w:shd w:color="2d5aa0" w:val="solid"/>
-        <w:spacing w:after="40" w:before="160"/>
+        <w:spacing w:before="160" w:after="40"/>
         <w:ind w:left="160" w:right="160"/>
       </w:pPr>
       <w:r>
         <w:rPr>
-          <w:rFonts w:ascii="Segoe UI Emoji" w:cs="Segoe UI Emoji" w:eastAsia="Segoe UI Emoji" w:hAnsi="Segoe UI Emoji"/>
           <w:sz w:val="26"/>
           <w:szCs w:val="26"/>
+          <w:rFonts w:ascii="Segoe UI Emoji" w:cs="Segoe UI Emoji" w:eastAsia="Segoe UI Emoji" w:hAnsi="Segoe UI Emoji"/>
         </w:rPr>
         <w:t xml:space="preserve">👥  </w:t>
       </w:r>
       <w:r>
         <w:rPr>
-          <w:rFonts w:ascii="Arial" w:cs="Arial" w:eastAsia="Arial" w:hAnsi="Arial"/>
           <w:b/>
           <w:bCs/>
           <w:color w:val="FFFFFF"/>
           <w:sz w:val="26"/>
           <w:szCs w:val="26"/>
+          <w:rFonts w:ascii="Arial" w:cs="Arial" w:eastAsia="Arial" w:hAnsi="Arial"/>
         </w:rPr>
         <w:t xml:space="preserve">B1  Mitarbeiter &amp; Kürzel verwalten</w:t>
       </w:r>
@@ -848,12 +848,11 @@
     </w:p>
     <w:p>
       <w:pPr>
-        <w:spacing w:after="20" w:before="20"/>
+        <w:spacing w:before="20" w:after="20"/>
         <w:jc w:val="left"/>
       </w:pPr>
       <w:r>
         <w:rPr>
-          <w:rFonts w:ascii="Arial" w:cs="Arial" w:eastAsia="Arial" w:hAnsi="Arial"/>
           <w:b w:val="false"/>
           <w:bCs w:val="false"/>
           <w:i w:val="false"/>
@@ -861,6 +860,7 @@
           <w:color w:val="111827"/>
           <w:sz w:val="22"/>
           <w:szCs w:val="22"/>
+          <w:rFonts w:ascii="Arial" w:cs="Arial" w:eastAsia="Arial" w:hAnsi="Arial"/>
         </w:rPr>
         <w:t xml:space="preserve">Pfad: Seitenleiste → 1.2 Mitarbeiter &amp; Kürzel</w:t>
       </w:r>
@@ -875,14 +875,14 @@
     </w:p>
     <w:p>
       <w:pPr>
-        <w:spacing w:after="20" w:before="80"/>
-      </w:pPr>
-      <w:r>
-        <w:rPr>
-          <w:rFonts w:ascii="Arial" w:cs="Arial" w:eastAsia="Arial" w:hAnsi="Arial"/>
+        <w:spacing w:before="80" w:after="20"/>
+      </w:pPr>
+      <w:r>
+        <w:rPr>
           <w:color w:val="6b7280"/>
           <w:sz w:val="18"/>
           <w:szCs w:val="18"/>
+          <w:rFonts w:ascii="Arial" w:cs="Arial" w:eastAsia="Arial" w:hAnsi="Arial"/>
         </w:rPr>
         <w:t xml:space="preserve">So sieht's aus:</w:t>
       </w:r>
@@ -916,26 +916,26 @@
           </w:tcPr>
           <w:p>
             <w:pPr>
-              <w:spacing w:after="40" w:before="40"/>
+              <w:spacing w:before="40" w:after="40"/>
               <w:ind w:left="80"/>
             </w:pPr>
             <w:r>
               <w:rPr>
-                <w:rFonts w:ascii="Courier New" w:cs="Courier New" w:eastAsia="Courier New" w:hAnsi="Courier New"/>
                 <w:color w:val="ef4444"/>
                 <w:sz w:val="16"/>
                 <w:szCs w:val="16"/>
+                <w:rFonts w:ascii="Courier New" w:cs="Courier New" w:eastAsia="Courier New" w:hAnsi="Courier New"/>
               </w:rPr>
               <w:t xml:space="preserve">●  ●  ●  </w:t>
             </w:r>
             <w:r>
               <w:rPr>
-                <w:rFonts w:ascii="Arial" w:cs="Arial" w:eastAsia="Arial" w:hAnsi="Arial"/>
                 <w:b/>
                 <w:bCs/>
                 <w:color w:val="FFFFFF"/>
                 <w:sz w:val="18"/>
                 <w:szCs w:val="18"/>
+                <w:rFonts w:ascii="Arial" w:cs="Arial" w:eastAsia="Arial" w:hAnsi="Arial"/>
               </w:rPr>
               <w:t xml:space="preserve">MiKa – Mitarbeiterverwaltung</w:t>
             </w:r>
@@ -956,17 +956,17 @@
           <w:p>
             <w:pPr>
               <w:shd w:color="eef4fb" w:val="solid"/>
-              <w:spacing w:after="30" w:before="30"/>
+              <w:spacing w:before="30" w:after="30"/>
               <w:ind w:left="120" w:right="120"/>
             </w:pPr>
             <w:r>
               <w:rPr>
-                <w:rFonts w:ascii="Arial" w:cs="Arial" w:eastAsia="Arial" w:hAnsi="Arial"/>
                 <w:b/>
                 <w:bCs/>
                 <w:color w:val="111827"/>
                 <w:sz w:val="19"/>
                 <w:szCs w:val="19"/>
+                <w:rFonts w:ascii="Arial" w:cs="Arial" w:eastAsia="Arial" w:hAnsi="Arial"/>
               </w:rPr>
               <w:t xml:space="preserve">👥  Mitarbeiter &amp; Kürzel            [+ Neuer Mitarbeiter]</w:t>
             </w:r>
@@ -986,17 +986,17 @@
           </w:tcPr>
           <w:p>
             <w:pPr>
-              <w:spacing w:after="30" w:before="30"/>
+              <w:spacing w:before="30" w:after="30"/>
               <w:ind w:left="120" w:right="120"/>
             </w:pPr>
             <w:r>
               <w:rPr>
-                <w:rFonts w:ascii="Arial" w:cs="Arial" w:eastAsia="Arial" w:hAnsi="Arial"/>
                 <w:b w:val="false"/>
                 <w:bCs w:val="false"/>
                 <w:color w:val="111827"/>
                 <w:sz w:val="19"/>
                 <w:szCs w:val="19"/>
+                <w:rFonts w:ascii="Arial" w:cs="Arial" w:eastAsia="Arial" w:hAnsi="Arial"/>
               </w:rPr>
               <w:t xml:space="preserve">  Max Müller       Kürzel: MM    Rolle: Mitarbeiter    ✅ aktiv  [Bearbeiten]</w:t>
             </w:r>
@@ -1016,17 +1016,17 @@
           </w:tcPr>
           <w:p>
             <w:pPr>
-              <w:spacing w:after="30" w:before="30"/>
+              <w:spacing w:before="30" w:after="30"/>
               <w:ind w:left="120" w:right="120"/>
             </w:pPr>
             <w:r>
               <w:rPr>
-                <w:rFonts w:ascii="Arial" w:cs="Arial" w:eastAsia="Arial" w:hAnsi="Arial"/>
                 <w:b w:val="false"/>
                 <w:bCs w:val="false"/>
                 <w:color w:val="111827"/>
                 <w:sz w:val="19"/>
                 <w:szCs w:val="19"/>
+                <w:rFonts w:ascii="Arial" w:cs="Arial" w:eastAsia="Arial" w:hAnsi="Arial"/>
               </w:rPr>
               <w:t xml:space="preserve">  Anna Schulze     Kürzel: AS    Rolle: Verwaltung     ✅ aktiv  [Bearbeiten]</w:t>
             </w:r>
@@ -1046,17 +1046,17 @@
           </w:tcPr>
           <w:p>
             <w:pPr>
-              <w:spacing w:after="30" w:before="30"/>
+              <w:spacing w:before="30" w:after="30"/>
               <w:ind w:left="120" w:right="120"/>
             </w:pPr>
             <w:r>
               <w:rPr>
-                <w:rFonts w:ascii="Arial" w:cs="Arial" w:eastAsia="Arial" w:hAnsi="Arial"/>
                 <w:b w:val="false"/>
                 <w:bCs w:val="false"/>
                 <w:color w:val="111827"/>
                 <w:sz w:val="19"/>
                 <w:szCs w:val="19"/>
+                <w:rFonts w:ascii="Arial" w:cs="Arial" w:eastAsia="Arial" w:hAnsi="Arial"/>
               </w:rPr>
               <w:t xml:space="preserve">  Klaus Fischer    Kürzel: KF    Rolle: Admin          ✅ aktiv  [Bearbeiten]</w:t>
             </w:r>
@@ -1076,17 +1076,17 @@
           </w:tcPr>
           <w:p>
             <w:pPr>
-              <w:spacing w:after="30" w:before="30"/>
+              <w:spacing w:before="30" w:after="30"/>
               <w:ind w:left="120" w:right="120"/>
             </w:pPr>
             <w:r>
               <w:rPr>
-                <w:rFonts w:ascii="Arial" w:cs="Arial" w:eastAsia="Arial" w:hAnsi="Arial"/>
                 <w:b w:val="false"/>
                 <w:bCs w:val="false"/>
                 <w:color w:val="6b7280"/>
                 <w:sz w:val="19"/>
                 <w:szCs w:val="19"/>
+                <w:rFonts w:ascii="Arial" w:cs="Arial" w:eastAsia="Arial" w:hAnsi="Arial"/>
               </w:rPr>
               <w:t xml:space="preserve">  Maria Huber      Kürzel: MH    Rolle: Mitarbeiter    ⛔ inaktiv</w:t>
             </w:r>
@@ -1103,74 +1103,73 @@
           <w:sz w:val="10"/>
           <w:szCs w:val="10"/>
         </w:rPr>
-        <w:t xml:space="preserve"/>
-      </w:r>
-    </w:p>
-    <w:p>
-      <w:pPr>
-        <w:spacing w:after="30" w:before="30"/>
+      </w:r>
+    </w:p>
+    <w:p>
+      <w:pPr>
+        <w:spacing w:before="30" w:after="30"/>
         <w:ind w:left="200"/>
       </w:pPr>
       <w:r>
         <w:rPr>
-          <w:rFonts w:ascii="Segoe UI Emoji" w:cs="Segoe UI Emoji" w:eastAsia="Segoe UI Emoji" w:hAnsi="Segoe UI Emoji"/>
-          <w:sz w:val="22"/>
-          <w:szCs w:val="22"/>
+          <w:sz w:val="22"/>
+          <w:szCs w:val="22"/>
+          <w:rFonts w:ascii="Segoe UI Emoji" w:cs="Segoe UI Emoji" w:eastAsia="Segoe UI Emoji" w:hAnsi="Segoe UI Emoji"/>
         </w:rPr>
         <w:t xml:space="preserve">➕  </w:t>
       </w:r>
       <w:r>
         <w:rPr>
-          <w:rFonts w:ascii="Arial" w:cs="Arial" w:eastAsia="Arial" w:hAnsi="Arial"/>
           <w:color w:val="111827"/>
           <w:sz w:val="22"/>
           <w:szCs w:val="22"/>
+          <w:rFonts w:ascii="Arial" w:cs="Arial" w:eastAsia="Arial" w:hAnsi="Arial"/>
         </w:rPr>
         <w:t xml:space="preserve">Neuen Mitarbeiter anlegen: «+ Neuer Mitarbeiter» → Name, Kürzel (2–4 Zeichen), PIN, Rolle</w:t>
       </w:r>
     </w:p>
     <w:p>
       <w:pPr>
-        <w:spacing w:after="30" w:before="30"/>
+        <w:spacing w:before="30" w:after="30"/>
         <w:ind w:left="200"/>
       </w:pPr>
       <w:r>
         <w:rPr>
-          <w:rFonts w:ascii="Segoe UI Emoji" w:cs="Segoe UI Emoji" w:eastAsia="Segoe UI Emoji" w:hAnsi="Segoe UI Emoji"/>
-          <w:sz w:val="22"/>
-          <w:szCs w:val="22"/>
+          <w:sz w:val="22"/>
+          <w:szCs w:val="22"/>
+          <w:rFonts w:ascii="Segoe UI Emoji" w:cs="Segoe UI Emoji" w:eastAsia="Segoe UI Emoji" w:hAnsi="Segoe UI Emoji"/>
         </w:rPr>
         <w:t xml:space="preserve">🔑  </w:t>
       </w:r>
       <w:r>
         <w:rPr>
-          <w:rFonts w:ascii="Arial" w:cs="Arial" w:eastAsia="Arial" w:hAnsi="Arial"/>
           <w:color w:val="111827"/>
           <w:sz w:val="22"/>
           <w:szCs w:val="22"/>
+          <w:rFonts w:ascii="Arial" w:cs="Arial" w:eastAsia="Arial" w:hAnsi="Arial"/>
         </w:rPr>
         <w:t xml:space="preserve">PIN ändern: Mitarbeiter anklicken → «PIN ändern»</w:t>
       </w:r>
     </w:p>
     <w:p>
       <w:pPr>
-        <w:spacing w:after="30" w:before="30"/>
+        <w:spacing w:before="30" w:after="30"/>
         <w:ind w:left="200"/>
       </w:pPr>
       <w:r>
         <w:rPr>
-          <w:rFonts w:ascii="Segoe UI Emoji" w:cs="Segoe UI Emoji" w:eastAsia="Segoe UI Emoji" w:hAnsi="Segoe UI Emoji"/>
-          <w:sz w:val="22"/>
-          <w:szCs w:val="22"/>
+          <w:sz w:val="22"/>
+          <w:szCs w:val="22"/>
+          <w:rFonts w:ascii="Segoe UI Emoji" w:cs="Segoe UI Emoji" w:eastAsia="Segoe UI Emoji" w:hAnsi="Segoe UI Emoji"/>
         </w:rPr>
         <w:t xml:space="preserve">🚫  </w:t>
       </w:r>
       <w:r>
         <w:rPr>
-          <w:rFonts w:ascii="Arial" w:cs="Arial" w:eastAsia="Arial" w:hAnsi="Arial"/>
           <w:color w:val="111827"/>
           <w:sz w:val="22"/>
           <w:szCs w:val="22"/>
+          <w:rFonts w:ascii="Arial" w:cs="Arial" w:eastAsia="Arial" w:hAnsi="Arial"/>
         </w:rPr>
         <w:t xml:space="preserve">Deaktivieren: Mitarbeiter anklicken → «Deaktivieren» – Einträge bleiben erhalten</w:t>
       </w:r>
@@ -1211,23 +1210,23 @@
           </w:tcPr>
           <w:p>
             <w:pPr>
-              <w:spacing w:after="60" w:before="60"/>
+              <w:spacing w:before="60" w:after="60"/>
               <w:ind w:left="80"/>
             </w:pPr>
             <w:r>
               <w:rPr>
-                <w:rFonts w:ascii="Segoe UI Emoji" w:cs="Segoe UI Emoji" w:eastAsia="Segoe UI Emoji" w:hAnsi="Segoe UI Emoji"/>
                 <w:sz w:val="22"/>
                 <w:szCs w:val="22"/>
+                <w:rFonts w:ascii="Segoe UI Emoji" w:cs="Segoe UI Emoji" w:eastAsia="Segoe UI Emoji" w:hAnsi="Segoe UI Emoji"/>
               </w:rPr>
               <w:t xml:space="preserve">⚠️  </w:t>
             </w:r>
             <w:r>
               <w:rPr>
-                <w:rFonts w:ascii="Arial" w:cs="Arial" w:eastAsia="Arial" w:hAnsi="Arial"/>
                 <w:color w:val="111827"/>
                 <w:sz w:val="21"/>
                 <w:szCs w:val="21"/>
+                <w:rFonts w:ascii="Arial" w:cs="Arial" w:eastAsia="Arial" w:hAnsi="Arial"/>
               </w:rPr>
               <w:t xml:space="preserve">Wenn ein Mitarbeiter das Unternehmen verlässt: sofort deaktivieren! Alte Einträge bleiben für das Archiv erhalten.</w:t>
             </w:r>
@@ -1246,25 +1245,25 @@
     <w:p>
       <w:pPr>
         <w:shd w:color="2d5aa0" w:val="solid"/>
-        <w:spacing w:after="40" w:before="160"/>
+        <w:spacing w:before="160" w:after="40"/>
         <w:ind w:left="160" w:right="160"/>
       </w:pPr>
       <w:r>
         <w:rPr>
-          <w:rFonts w:ascii="Segoe UI Emoji" w:cs="Segoe UI Emoji" w:eastAsia="Segoe UI Emoji" w:hAnsi="Segoe UI Emoji"/>
           <w:sz w:val="26"/>
           <w:szCs w:val="26"/>
+          <w:rFonts w:ascii="Segoe UI Emoji" w:cs="Segoe UI Emoji" w:eastAsia="Segoe UI Emoji" w:hAnsi="Segoe UI Emoji"/>
         </w:rPr>
         <w:t xml:space="preserve">🎓  </w:t>
       </w:r>
       <w:r>
         <w:rPr>
-          <w:rFonts w:ascii="Arial" w:cs="Arial" w:eastAsia="Arial" w:hAnsi="Arial"/>
           <w:b/>
           <w:bCs/>
           <w:color w:val="FFFFFF"/>
           <w:sz w:val="26"/>
           <w:szCs w:val="26"/>
+          <w:rFonts w:ascii="Arial" w:cs="Arial" w:eastAsia="Arial" w:hAnsi="Arial"/>
         </w:rPr>
         <w:t xml:space="preserve">B2  Schulungsnachweise  (1.4)</w:t>
       </w:r>
@@ -1279,12 +1278,11 @@
     </w:p>
     <w:p>
       <w:pPr>
-        <w:spacing w:after="20" w:before="20"/>
+        <w:spacing w:before="20" w:after="20"/>
         <w:jc w:val="left"/>
       </w:pPr>
       <w:r>
         <w:rPr>
-          <w:rFonts w:ascii="Arial" w:cs="Arial" w:eastAsia="Arial" w:hAnsi="Arial"/>
           <w:b w:val="false"/>
           <w:bCs w:val="false"/>
           <w:i w:val="false"/>
@@ -1292,6 +1290,7 @@
           <w:color w:val="111827"/>
           <w:sz w:val="22"/>
           <w:szCs w:val="22"/>
+          <w:rFonts w:ascii="Arial" w:cs="Arial" w:eastAsia="Arial" w:hAnsi="Arial"/>
         </w:rPr>
         <w:t xml:space="preserve">Pfad: Seitenleiste → 1.4 Schulungsnachweise</w:t>
       </w:r>
@@ -1306,69 +1305,69 @@
     </w:p>
     <w:p>
       <w:pPr>
-        <w:spacing w:after="30" w:before="30"/>
+        <w:spacing w:before="30" w:after="30"/>
         <w:ind w:left="200"/>
       </w:pPr>
       <w:r>
         <w:rPr>
-          <w:rFonts w:ascii="Segoe UI Emoji" w:cs="Segoe UI Emoji" w:eastAsia="Segoe UI Emoji" w:hAnsi="Segoe UI Emoji"/>
-          <w:sz w:val="22"/>
-          <w:szCs w:val="22"/>
+          <w:sz w:val="22"/>
+          <w:szCs w:val="22"/>
+          <w:rFonts w:ascii="Segoe UI Emoji" w:cs="Segoe UI Emoji" w:eastAsia="Segoe UI Emoji" w:hAnsi="Segoe UI Emoji"/>
         </w:rPr>
         <w:t xml:space="preserve">📅  </w:t>
       </w:r>
       <w:r>
         <w:rPr>
-          <w:rFonts w:ascii="Arial" w:cs="Arial" w:eastAsia="Arial" w:hAnsi="Arial"/>
           <w:color w:val="111827"/>
           <w:sz w:val="22"/>
           <w:szCs w:val="22"/>
+          <w:rFonts w:ascii="Arial" w:cs="Arial" w:eastAsia="Arial" w:hAnsi="Arial"/>
         </w:rPr>
         <w:t xml:space="preserve">Schulung eintragen: Datum, Thema und Teilnehmer angeben</w:t>
       </w:r>
     </w:p>
     <w:p>
       <w:pPr>
-        <w:spacing w:after="30" w:before="30"/>
+        <w:spacing w:before="30" w:after="30"/>
         <w:ind w:left="200"/>
       </w:pPr>
       <w:r>
         <w:rPr>
-          <w:rFonts w:ascii="Segoe UI Emoji" w:cs="Segoe UI Emoji" w:eastAsia="Segoe UI Emoji" w:hAnsi="Segoe UI Emoji"/>
-          <w:sz w:val="22"/>
-          <w:szCs w:val="22"/>
+          <w:sz w:val="22"/>
+          <w:szCs w:val="22"/>
+          <w:rFonts w:ascii="Segoe UI Emoji" w:cs="Segoe UI Emoji" w:eastAsia="Segoe UI Emoji" w:hAnsi="Segoe UI Emoji"/>
         </w:rPr>
         <w:t xml:space="preserve">📎  </w:t>
       </w:r>
       <w:r>
         <w:rPr>
-          <w:rFonts w:ascii="Arial" w:cs="Arial" w:eastAsia="Arial" w:hAnsi="Arial"/>
           <w:color w:val="111827"/>
           <w:sz w:val="22"/>
           <w:szCs w:val="22"/>
+          <w:rFonts w:ascii="Arial" w:cs="Arial" w:eastAsia="Arial" w:hAnsi="Arial"/>
         </w:rPr>
         <w:t xml:space="preserve">Belege vermerken: Zertifikate oder Fotos als Kommentar hinterlegen</w:t>
       </w:r>
     </w:p>
     <w:p>
       <w:pPr>
-        <w:spacing w:after="30" w:before="30"/>
+        <w:spacing w:before="30" w:after="30"/>
         <w:ind w:left="200"/>
       </w:pPr>
       <w:r>
         <w:rPr>
-          <w:rFonts w:ascii="Segoe UI Emoji" w:cs="Segoe UI Emoji" w:eastAsia="Segoe UI Emoji" w:hAnsi="Segoe UI Emoji"/>
-          <w:sz w:val="22"/>
-          <w:szCs w:val="22"/>
+          <w:sz w:val="22"/>
+          <w:szCs w:val="22"/>
+          <w:rFonts w:ascii="Segoe UI Emoji" w:cs="Segoe UI Emoji" w:eastAsia="Segoe UI Emoji" w:hAnsi="Segoe UI Emoji"/>
         </w:rPr>
         <w:t xml:space="preserve">📊  </w:t>
       </w:r>
       <w:r>
         <w:rPr>
-          <w:rFonts w:ascii="Arial" w:cs="Arial" w:eastAsia="Arial" w:hAnsi="Arial"/>
           <w:color w:val="111827"/>
           <w:sz w:val="22"/>
           <w:szCs w:val="22"/>
+          <w:rFonts w:ascii="Arial" w:cs="Arial" w:eastAsia="Arial" w:hAnsi="Arial"/>
         </w:rPr>
         <w:t xml:space="preserve">Übersicht: Alle Schulungen nach Datum sortiert, letzte Schulung pro Mitarbeiter sichtbar</w:t>
       </w:r>
@@ -1384,25 +1383,25 @@
     <w:p>
       <w:pPr>
         <w:shd w:color="2d5aa0" w:val="solid"/>
-        <w:spacing w:after="40" w:before="160"/>
+        <w:spacing w:before="160" w:after="40"/>
         <w:ind w:left="160" w:right="160"/>
       </w:pPr>
       <w:r>
         <w:rPr>
-          <w:rFonts w:ascii="Segoe UI Emoji" w:cs="Segoe UI Emoji" w:eastAsia="Segoe UI Emoji" w:hAnsi="Segoe UI Emoji"/>
           <w:sz w:val="26"/>
           <w:szCs w:val="26"/>
+          <w:rFonts w:ascii="Segoe UI Emoji" w:cs="Segoe UI Emoji" w:eastAsia="Segoe UI Emoji" w:hAnsi="Segoe UI Emoji"/>
         </w:rPr>
         <w:t xml:space="preserve">🧹  </w:t>
       </w:r>
       <w:r>
         <w:rPr>
-          <w:rFonts w:ascii="Arial" w:cs="Arial" w:eastAsia="Arial" w:hAnsi="Arial"/>
           <w:b/>
           <w:bCs/>
           <w:color w:val="FFFFFF"/>
           <w:sz w:val="26"/>
           <w:szCs w:val="26"/>
+          <w:rFonts w:ascii="Arial" w:cs="Arial" w:eastAsia="Arial" w:hAnsi="Arial"/>
         </w:rPr>
         <w:t xml:space="preserve">B3  Jahres-Reinigungsplan  (1.5)</w:t>
       </w:r>
@@ -1417,12 +1416,11 @@
     </w:p>
     <w:p>
       <w:pPr>
-        <w:spacing w:after="20" w:before="20"/>
+        <w:spacing w:before="20" w:after="20"/>
         <w:jc w:val="left"/>
       </w:pPr>
       <w:r>
         <w:rPr>
-          <w:rFonts w:ascii="Arial" w:cs="Arial" w:eastAsia="Arial" w:hAnsi="Arial"/>
           <w:b w:val="false"/>
           <w:bCs w:val="false"/>
           <w:i w:val="false"/>
@@ -1430,6 +1428,7 @@
           <w:color w:val="111827"/>
           <w:sz w:val="22"/>
           <w:szCs w:val="22"/>
+          <w:rFonts w:ascii="Arial" w:cs="Arial" w:eastAsia="Arial" w:hAnsi="Arial"/>
         </w:rPr>
         <w:t xml:space="preserve">Pfad: Seitenleiste → 1.5 Reinigungsplan Jahr</w:t>
       </w:r>
@@ -1444,46 +1443,46 @@
     </w:p>
     <w:p>
       <w:pPr>
-        <w:spacing w:after="30" w:before="30"/>
+        <w:spacing w:before="30" w:after="30"/>
         <w:ind w:left="200"/>
       </w:pPr>
       <w:r>
         <w:rPr>
-          <w:rFonts w:ascii="Segoe UI Emoji" w:cs="Segoe UI Emoji" w:eastAsia="Segoe UI Emoji" w:hAnsi="Segoe UI Emoji"/>
-          <w:sz w:val="22"/>
-          <w:szCs w:val="22"/>
+          <w:sz w:val="22"/>
+          <w:szCs w:val="22"/>
+          <w:rFonts w:ascii="Segoe UI Emoji" w:cs="Segoe UI Emoji" w:eastAsia="Segoe UI Emoji" w:hAnsi="Segoe UI Emoji"/>
         </w:rPr>
         <w:t xml:space="preserve">📋  </w:t>
       </w:r>
       <w:r>
         <w:rPr>
-          <w:rFonts w:ascii="Arial" w:cs="Arial" w:eastAsia="Arial" w:hAnsi="Arial"/>
           <w:color w:val="111827"/>
           <w:sz w:val="22"/>
           <w:szCs w:val="22"/>
+          <w:rFonts w:ascii="Arial" w:cs="Arial" w:eastAsia="Arial" w:hAnsi="Arial"/>
         </w:rPr>
         <w:t xml:space="preserve">Jährliche Reinigungsintervalle planen (täglich / wöchentlich / monatlich)</w:t>
       </w:r>
     </w:p>
     <w:p>
       <w:pPr>
-        <w:spacing w:after="30" w:before="30"/>
+        <w:spacing w:before="30" w:after="30"/>
         <w:ind w:left="200"/>
       </w:pPr>
       <w:r>
         <w:rPr>
-          <w:rFonts w:ascii="Segoe UI Emoji" w:cs="Segoe UI Emoji" w:eastAsia="Segoe UI Emoji" w:hAnsi="Segoe UI Emoji"/>
-          <w:sz w:val="22"/>
-          <w:szCs w:val="22"/>
+          <w:sz w:val="22"/>
+          <w:szCs w:val="22"/>
+          <w:rFonts w:ascii="Segoe UI Emoji" w:cs="Segoe UI Emoji" w:eastAsia="Segoe UI Emoji" w:hAnsi="Segoe UI Emoji"/>
         </w:rPr>
         <w:t xml:space="preserve">🖨️  </w:t>
       </w:r>
       <w:r>
         <w:rPr>
-          <w:rFonts w:ascii="Arial" w:cs="Arial" w:eastAsia="Arial" w:hAnsi="Arial"/>
           <w:color w:val="111827"/>
           <w:sz w:val="22"/>
           <w:szCs w:val="22"/>
+          <w:rFonts w:ascii="Arial" w:cs="Arial" w:eastAsia="Arial" w:hAnsi="Arial"/>
         </w:rPr>
         <w:t xml:space="preserve">Am Jahresende als PDF ausdrucken für die Behörden</w:t>
       </w:r>
@@ -1499,25 +1498,25 @@
     <w:p>
       <w:pPr>
         <w:shd w:color="2d5aa0" w:val="solid"/>
-        <w:spacing w:after="40" w:before="160"/>
+        <w:spacing w:before="160" w:after="40"/>
         <w:ind w:left="160" w:right="160"/>
       </w:pPr>
       <w:r>
         <w:rPr>
-          <w:rFonts w:ascii="Segoe UI Emoji" w:cs="Segoe UI Emoji" w:eastAsia="Segoe UI Emoji" w:hAnsi="Segoe UI Emoji"/>
           <w:sz w:val="26"/>
           <w:szCs w:val="26"/>
+          <w:rFonts w:ascii="Segoe UI Emoji" w:cs="Segoe UI Emoji" w:eastAsia="Segoe UI Emoji" w:hAnsi="Segoe UI Emoji"/>
         </w:rPr>
         <w:t xml:space="preserve">🚛  </w:t>
       </w:r>
       <w:r>
         <w:rPr>
-          <w:rFonts w:ascii="Arial" w:cs="Arial" w:eastAsia="Arial" w:hAnsi="Arial"/>
           <w:b/>
           <w:bCs/>
           <w:color w:val="FFFFFF"/>
           <w:sz w:val="26"/>
           <w:szCs w:val="26"/>
+          <w:rFonts w:ascii="Arial" w:cs="Arial" w:eastAsia="Arial" w:hAnsi="Arial"/>
         </w:rPr>
         <w:t xml:space="preserve">B4  Lieferanten konfigurieren</w:t>
       </w:r>
@@ -1532,12 +1531,11 @@
     </w:p>
     <w:p>
       <w:pPr>
-        <w:spacing w:after="20" w:before="20"/>
+        <w:spacing w:before="20" w:after="20"/>
         <w:jc w:val="left"/>
       </w:pPr>
       <w:r>
         <w:rPr>
-          <w:rFonts w:ascii="Arial" w:cs="Arial" w:eastAsia="Arial" w:hAnsi="Arial"/>
           <w:b w:val="false"/>
           <w:bCs w:val="false"/>
           <w:i w:val="false"/>
@@ -1545,6 +1543,7 @@
           <w:color w:val="111827"/>
           <w:sz w:val="22"/>
           <w:szCs w:val="22"/>
+          <w:rFonts w:ascii="Arial" w:cs="Arial" w:eastAsia="Arial" w:hAnsi="Arial"/>
         </w:rPr>
         <w:t xml:space="preserve">Pfad: In den Wareneingängen (2.1 oder 3.1) → Admin-Bereich öffnen (Zahnrad-Icon)</w:t>
       </w:r>
@@ -1559,14 +1558,14 @@
     </w:p>
     <w:p>
       <w:pPr>
-        <w:spacing w:after="20" w:before="80"/>
-      </w:pPr>
-      <w:r>
-        <w:rPr>
-          <w:rFonts w:ascii="Arial" w:cs="Arial" w:eastAsia="Arial" w:hAnsi="Arial"/>
+        <w:spacing w:before="80" w:after="20"/>
+      </w:pPr>
+      <w:r>
+        <w:rPr>
           <w:color w:val="6b7280"/>
           <w:sz w:val="18"/>
           <w:szCs w:val="18"/>
+          <w:rFonts w:ascii="Arial" w:cs="Arial" w:eastAsia="Arial" w:hAnsi="Arial"/>
         </w:rPr>
         <w:t xml:space="preserve">So sieht's aus:</w:t>
       </w:r>
@@ -1600,26 +1599,26 @@
           </w:tcPr>
           <w:p>
             <w:pPr>
-              <w:spacing w:after="40" w:before="40"/>
+              <w:spacing w:before="40" w:after="40"/>
               <w:ind w:left="80"/>
             </w:pPr>
             <w:r>
               <w:rPr>
-                <w:rFonts w:ascii="Courier New" w:cs="Courier New" w:eastAsia="Courier New" w:hAnsi="Courier New"/>
                 <w:color w:val="ef4444"/>
                 <w:sz w:val="16"/>
                 <w:szCs w:val="16"/>
+                <w:rFonts w:ascii="Courier New" w:cs="Courier New" w:eastAsia="Courier New" w:hAnsi="Courier New"/>
               </w:rPr>
               <w:t xml:space="preserve">●  ●  ●  </w:t>
             </w:r>
             <w:r>
               <w:rPr>
-                <w:rFonts w:ascii="Arial" w:cs="Arial" w:eastAsia="Arial" w:hAnsi="Arial"/>
                 <w:b/>
                 <w:bCs/>
                 <w:color w:val="FFFFFF"/>
                 <w:sz w:val="18"/>
                 <w:szCs w:val="18"/>
+                <w:rFonts w:ascii="Arial" w:cs="Arial" w:eastAsia="Arial" w:hAnsi="Arial"/>
               </w:rPr>
               <w:t xml:space="preserve">MiKa – Lieferanten-Konfiguration</w:t>
             </w:r>
@@ -1640,17 +1639,17 @@
           <w:p>
             <w:pPr>
               <w:shd w:color="eef4fb" w:val="solid"/>
-              <w:spacing w:after="30" w:before="30"/>
+              <w:spacing w:before="30" w:after="30"/>
               <w:ind w:left="120" w:right="120"/>
             </w:pPr>
             <w:r>
               <w:rPr>
-                <w:rFonts w:ascii="Arial" w:cs="Arial" w:eastAsia="Arial" w:hAnsi="Arial"/>
                 <w:b/>
                 <w:bCs/>
                 <w:color w:val="111827"/>
                 <w:sz w:val="19"/>
                 <w:szCs w:val="19"/>
+                <w:rFonts w:ascii="Arial" w:cs="Arial" w:eastAsia="Arial" w:hAnsi="Arial"/>
               </w:rPr>
               <w:t xml:space="preserve">⚙️  Admin – Lieferanten                [+ Neuer Lieferant]</w:t>
             </w:r>
@@ -1670,17 +1669,17 @@
           </w:tcPr>
           <w:p>
             <w:pPr>
-              <w:spacing w:after="30" w:before="30"/>
+              <w:spacing w:before="30" w:after="30"/>
               <w:ind w:left="120" w:right="120"/>
             </w:pPr>
             <w:r>
               <w:rPr>
-                <w:rFonts w:ascii="Arial" w:cs="Arial" w:eastAsia="Arial" w:hAnsi="Arial"/>
                 <w:b/>
                 <w:bCs/>
                 <w:color w:val="111827"/>
                 <w:sz w:val="19"/>
                 <w:szCs w:val="19"/>
+                <w:rFonts w:ascii="Arial" w:cs="Arial" w:eastAsia="Arial" w:hAnsi="Arial"/>
               </w:rPr>
               <w:t xml:space="preserve">  ▼  Frische GmbH  (Obst &amp; Gemüse)    Liefertage: Di, Do, Fr</w:t>
             </w:r>
@@ -1700,17 +1699,17 @@
           </w:tcPr>
           <w:p>
             <w:pPr>
-              <w:spacing w:after="30" w:before="30"/>
+              <w:spacing w:before="30" w:after="30"/>
               <w:ind w:left="200" w:right="120"/>
             </w:pPr>
             <w:r>
               <w:rPr>
-                <w:rFonts w:ascii="Arial" w:cs="Arial" w:eastAsia="Arial" w:hAnsi="Arial"/>
                 <w:b w:val="false"/>
                 <w:bCs w:val="false"/>
                 <w:color w:val="111827"/>
                 <w:sz w:val="19"/>
                 <w:szCs w:val="19"/>
+                <w:rFonts w:ascii="Arial" w:cs="Arial" w:eastAsia="Arial" w:hAnsi="Arial"/>
               </w:rPr>
               <w:t xml:space="preserve">      Kriterien:  ✅ Hygiene  ✅ Etikettierung  ✅ QS-Siegel  ✅ Temp. OG</w:t>
             </w:r>
@@ -1730,17 +1729,17 @@
           </w:tcPr>
           <w:p>
             <w:pPr>
-              <w:spacing w:after="30" w:before="30"/>
+              <w:spacing w:before="30" w:after="30"/>
               <w:ind w:left="200" w:right="120"/>
             </w:pPr>
             <w:r>
               <w:rPr>
-                <w:rFonts w:ascii="Arial" w:cs="Arial" w:eastAsia="Arial" w:hAnsi="Arial"/>
                 <w:b w:val="false"/>
                 <w:bCs w:val="false"/>
                 <w:color w:val="b91c1c"/>
                 <w:sz w:val="19"/>
                 <w:szCs w:val="19"/>
+                <w:rFonts w:ascii="Arial" w:cs="Arial" w:eastAsia="Arial" w:hAnsi="Arial"/>
               </w:rPr>
               <w:t xml:space="preserve">      Ausnahmen:  15.05.2025 → kein Liefertag (Feiertag)</w:t>
             </w:r>
@@ -1760,17 +1759,17 @@
           </w:tcPr>
           <w:p>
             <w:pPr>
-              <w:spacing w:after="30" w:before="30"/>
+              <w:spacing w:before="30" w:after="30"/>
               <w:ind w:left="120" w:right="120"/>
             </w:pPr>
             <w:r>
               <w:rPr>
-                <w:rFonts w:ascii="Arial" w:cs="Arial" w:eastAsia="Arial" w:hAnsi="Arial"/>
                 <w:b/>
                 <w:bCs/>
                 <w:color w:val="111827"/>
                 <w:sz w:val="19"/>
                 <w:szCs w:val="19"/>
+                <w:rFonts w:ascii="Arial" w:cs="Arial" w:eastAsia="Arial" w:hAnsi="Arial"/>
               </w:rPr>
               <w:t xml:space="preserve">  ▶  Metzger König  (Fleisch)          Liefertage: Mo, Mi, Fr</w:t>
             </w:r>
@@ -1790,17 +1789,17 @@
           </w:tcPr>
           <w:p>
             <w:pPr>
-              <w:spacing w:after="30" w:before="30"/>
+              <w:spacing w:before="30" w:after="30"/>
               <w:ind w:left="120" w:right="120"/>
             </w:pPr>
             <w:r>
               <w:rPr>
-                <w:rFonts w:ascii="Arial" w:cs="Arial" w:eastAsia="Arial" w:hAnsi="Arial"/>
                 <w:b/>
                 <w:bCs/>
                 <w:color w:val="111827"/>
                 <w:sz w:val="19"/>
                 <w:szCs w:val="19"/>
+                <w:rFonts w:ascii="Arial" w:cs="Arial" w:eastAsia="Arial" w:hAnsi="Arial"/>
               </w:rPr>
               <w:t xml:space="preserve">  ▶  Fisch Maier    (Fisch)            Liefertage: Di, Fr</w:t>
             </w:r>
@@ -1817,7 +1816,6 @@
           <w:sz w:val="10"/>
           <w:szCs w:val="10"/>
         </w:rPr>
-        <w:t xml:space="preserve"/>
       </w:r>
     </w:p>
     <w:tbl>
@@ -1855,12 +1853,12 @@
             </w:pPr>
             <w:r>
               <w:rPr>
-                <w:rFonts w:ascii="Arial" w:cs="Arial" w:eastAsia="Arial" w:hAnsi="Arial"/>
                 <w:b/>
                 <w:bCs/>
                 <w:color w:val="FFFFFF"/>
                 <w:sz w:val="32"/>
                 <w:szCs w:val="32"/>
+                <w:rFonts w:ascii="Arial" w:cs="Arial" w:eastAsia="Arial" w:hAnsi="Arial"/>
               </w:rPr>
               <w:t xml:space="preserve">1</w:t>
             </w:r>
@@ -1884,30 +1882,30 @@
           </w:tcPr>
           <w:p>
             <w:pPr>
-              <w:spacing w:after="20" w:before="40"/>
-            </w:pPr>
-            <w:r>
-              <w:rPr>
-                <w:rFonts w:ascii="Arial" w:cs="Arial" w:eastAsia="Arial" w:hAnsi="Arial"/>
+              <w:spacing w:before="40" w:after="20"/>
+            </w:pPr>
+            <w:r>
+              <w:rPr>
                 <w:b/>
                 <w:bCs/>
                 <w:color w:val="1a3a6b"/>
                 <w:sz w:val="24"/>
                 <w:szCs w:val="24"/>
+                <w:rFonts w:ascii="Arial" w:cs="Arial" w:eastAsia="Arial" w:hAnsi="Arial"/>
               </w:rPr>
               <w:t xml:space="preserve">Lieferant anlegen</w:t>
             </w:r>
           </w:p>
           <w:p>
             <w:pPr>
-              <w:spacing w:after="60" w:before="0"/>
-            </w:pPr>
-            <w:r>
-              <w:rPr>
-                <w:rFonts w:ascii="Arial" w:cs="Arial" w:eastAsia="Arial" w:hAnsi="Arial"/>
+              <w:spacing w:before="0" w:after="60"/>
+            </w:pPr>
+            <w:r>
+              <w:rPr>
                 <w:color w:val="111827"/>
                 <w:sz w:val="21"/>
                 <w:szCs w:val="21"/>
+                <w:rFonts w:ascii="Arial" w:cs="Arial" w:eastAsia="Arial" w:hAnsi="Arial"/>
               </w:rPr>
               <w:t xml:space="preserve">«+ Neuer Lieferant» → Name, Warenart wählen → Kriterien aktivieren → Liefertage einstellen → Speichern</w:t>
             </w:r>
@@ -1958,12 +1956,12 @@
             </w:pPr>
             <w:r>
               <w:rPr>
-                <w:rFonts w:ascii="Arial" w:cs="Arial" w:eastAsia="Arial" w:hAnsi="Arial"/>
                 <w:b/>
                 <w:bCs/>
                 <w:color w:val="FFFFFF"/>
                 <w:sz w:val="32"/>
                 <w:szCs w:val="32"/>
+                <w:rFonts w:ascii="Arial" w:cs="Arial" w:eastAsia="Arial" w:hAnsi="Arial"/>
               </w:rPr>
               <w:t xml:space="preserve">2</w:t>
             </w:r>
@@ -1987,30 +1985,30 @@
           </w:tcPr>
           <w:p>
             <w:pPr>
-              <w:spacing w:after="20" w:before="40"/>
-            </w:pPr>
-            <w:r>
-              <w:rPr>
-                <w:rFonts w:ascii="Arial" w:cs="Arial" w:eastAsia="Arial" w:hAnsi="Arial"/>
+              <w:spacing w:before="40" w:after="20"/>
+            </w:pPr>
+            <w:r>
+              <w:rPr>
                 <w:b/>
                 <w:bCs/>
                 <w:color w:val="1a3a6b"/>
                 <w:sz w:val="24"/>
                 <w:szCs w:val="24"/>
+                <w:rFonts w:ascii="Arial" w:cs="Arial" w:eastAsia="Arial" w:hAnsi="Arial"/>
               </w:rPr>
               <w:t xml:space="preserve">Temperaturbereiche wählen</w:t>
             </w:r>
           </w:p>
           <w:p>
             <w:pPr>
-              <w:spacing w:after="60" w:before="0"/>
-            </w:pPr>
-            <w:r>
-              <w:rPr>
-                <w:rFonts w:ascii="Arial" w:cs="Arial" w:eastAsia="Arial" w:hAnsi="Arial"/>
+              <w:spacing w:before="0" w:after="60"/>
+            </w:pPr>
+            <w:r>
+              <w:rPr>
                 <w:color w:val="111827"/>
                 <w:sz w:val="21"/>
                 <w:szCs w:val="21"/>
+                <w:rFonts w:ascii="Arial" w:cs="Arial" w:eastAsia="Arial" w:hAnsi="Arial"/>
               </w:rPr>
               <w:t xml:space="preserve">Nur die Bereiche aktivieren, die für diesen Lieferanten wirklich relevant sind (z.B. Fleisch + Molkerei)</w:t>
             </w:r>
@@ -2061,12 +2059,12 @@
             </w:pPr>
             <w:r>
               <w:rPr>
-                <w:rFonts w:ascii="Arial" w:cs="Arial" w:eastAsia="Arial" w:hAnsi="Arial"/>
                 <w:b/>
                 <w:bCs/>
                 <w:color w:val="FFFFFF"/>
                 <w:sz w:val="32"/>
                 <w:szCs w:val="32"/>
+                <w:rFonts w:ascii="Arial" w:cs="Arial" w:eastAsia="Arial" w:hAnsi="Arial"/>
               </w:rPr>
               <w:t xml:space="preserve">3</w:t>
             </w:r>
@@ -2090,30 +2088,30 @@
           </w:tcPr>
           <w:p>
             <w:pPr>
-              <w:spacing w:after="20" w:before="40"/>
-            </w:pPr>
-            <w:r>
-              <w:rPr>
-                <w:rFonts w:ascii="Arial" w:cs="Arial" w:eastAsia="Arial" w:hAnsi="Arial"/>
+              <w:spacing w:before="40" w:after="20"/>
+            </w:pPr>
+            <w:r>
+              <w:rPr>
                 <w:b/>
                 <w:bCs/>
                 <w:color w:val="1a3a6b"/>
                 <w:sz w:val="24"/>
                 <w:szCs w:val="24"/>
+                <w:rFonts w:ascii="Arial" w:cs="Arial" w:eastAsia="Arial" w:hAnsi="Arial"/>
               </w:rPr>
               <w:t xml:space="preserve">Ausnahmen einrichten</w:t>
             </w:r>
           </w:p>
           <w:p>
             <w:pPr>
-              <w:spacing w:after="60" w:before="0"/>
-            </w:pPr>
-            <w:r>
-              <w:rPr>
-                <w:rFonts w:ascii="Arial" w:cs="Arial" w:eastAsia="Arial" w:hAnsi="Arial"/>
+              <w:spacing w:before="0" w:after="60"/>
+            </w:pPr>
+            <w:r>
+              <w:rPr>
                 <w:color w:val="111827"/>
                 <w:sz w:val="21"/>
                 <w:szCs w:val="21"/>
+                <w:rFonts w:ascii="Arial" w:cs="Arial" w:eastAsia="Arial" w:hAnsi="Arial"/>
               </w:rPr>
               <w:t xml:space="preserve">Für Feiertage oder verschobene Liefertage: Datum eintragen → Typ wählen → Hinzufügen</w:t>
             </w:r>
@@ -2132,25 +2130,25 @@
     <w:p>
       <w:pPr>
         <w:shd w:color="2d5aa0" w:val="solid"/>
-        <w:spacing w:after="40" w:before="160"/>
+        <w:spacing w:before="160" w:after="40"/>
         <w:ind w:left="160" w:right="160"/>
       </w:pPr>
       <w:r>
         <w:rPr>
-          <w:rFonts w:ascii="Segoe UI Emoji" w:cs="Segoe UI Emoji" w:eastAsia="Segoe UI Emoji" w:hAnsi="Segoe UI Emoji"/>
           <w:sz w:val="26"/>
           <w:szCs w:val="26"/>
+          <w:rFonts w:ascii="Segoe UI Emoji" w:cs="Segoe UI Emoji" w:eastAsia="Segoe UI Emoji" w:hAnsi="Segoe UI Emoji"/>
         </w:rPr>
         <w:t xml:space="preserve">📊  </w:t>
       </w:r>
       <w:r>
         <w:rPr>
-          <w:rFonts w:ascii="Arial" w:cs="Arial" w:eastAsia="Arial" w:hAnsi="Arial"/>
           <w:b/>
           <w:bCs/>
           <w:color w:val="FFFFFF"/>
           <w:sz w:val="26"/>
           <w:szCs w:val="26"/>
+          <w:rFonts w:ascii="Arial" w:cs="Arial" w:eastAsia="Arial" w:hAnsi="Arial"/>
         </w:rPr>
         <w:t xml:space="preserve">B5  Monatsberichte</w:t>
       </w:r>
@@ -2165,92 +2163,92 @@
     </w:p>
     <w:p>
       <w:pPr>
-        <w:spacing w:after="30" w:before="30"/>
+        <w:spacing w:before="30" w:after="30"/>
         <w:ind w:left="200"/>
       </w:pPr>
       <w:r>
         <w:rPr>
-          <w:rFonts w:ascii="Segoe UI Emoji" w:cs="Segoe UI Emoji" w:eastAsia="Segoe UI Emoji" w:hAnsi="Segoe UI Emoji"/>
-          <w:sz w:val="22"/>
-          <w:szCs w:val="22"/>
+          <w:sz w:val="22"/>
+          <w:szCs w:val="22"/>
+          <w:rFonts w:ascii="Segoe UI Emoji" w:cs="Segoe UI Emoji" w:eastAsia="Segoe UI Emoji" w:hAnsi="Segoe UI Emoji"/>
         </w:rPr>
         <w:t xml:space="preserve">🖨️  </w:t>
       </w:r>
       <w:r>
         <w:rPr>
-          <w:rFonts w:ascii="Arial" w:cs="Arial" w:eastAsia="Arial" w:hAnsi="Arial"/>
           <w:color w:val="111827"/>
           <w:sz w:val="22"/>
           <w:szCs w:val="22"/>
+          <w:rFonts w:ascii="Arial" w:cs="Arial" w:eastAsia="Arial" w:hAnsi="Arial"/>
         </w:rPr>
         <w:t xml:space="preserve">Bericht generieren: Monat wählen → «PDF erstellen»</w:t>
       </w:r>
     </w:p>
     <w:p>
       <w:pPr>
-        <w:spacing w:after="30" w:before="30"/>
+        <w:spacing w:before="30" w:after="30"/>
         <w:ind w:left="200"/>
       </w:pPr>
       <w:r>
         <w:rPr>
-          <w:rFonts w:ascii="Segoe UI Emoji" w:cs="Segoe UI Emoji" w:eastAsia="Segoe UI Emoji" w:hAnsi="Segoe UI Emoji"/>
-          <w:sz w:val="22"/>
-          <w:szCs w:val="22"/>
+          <w:sz w:val="22"/>
+          <w:szCs w:val="22"/>
+          <w:rFonts w:ascii="Segoe UI Emoji" w:cs="Segoe UI Emoji" w:eastAsia="Segoe UI Emoji" w:hAnsi="Segoe UI Emoji"/>
         </w:rPr>
         <w:t xml:space="preserve">📧  </w:t>
       </w:r>
       <w:r>
         <w:rPr>
-          <w:rFonts w:ascii="Arial" w:cs="Arial" w:eastAsia="Arial" w:hAnsi="Arial"/>
           <w:color w:val="111827"/>
           <w:sz w:val="22"/>
           <w:szCs w:val="22"/>
+          <w:rFonts w:ascii="Arial" w:cs="Arial" w:eastAsia="Arial" w:hAnsi="Arial"/>
         </w:rPr>
         <w:t xml:space="preserve">Per E-Mail versenden: Direkt aus dem System heraus möglich</w:t>
       </w:r>
     </w:p>
     <w:p>
       <w:pPr>
-        <w:spacing w:after="30" w:before="30"/>
+        <w:spacing w:before="30" w:after="30"/>
         <w:ind w:left="200"/>
       </w:pPr>
       <w:r>
         <w:rPr>
-          <w:rFonts w:ascii="Segoe UI Emoji" w:cs="Segoe UI Emoji" w:eastAsia="Segoe UI Emoji" w:hAnsi="Segoe UI Emoji"/>
-          <w:sz w:val="22"/>
-          <w:szCs w:val="22"/>
+          <w:sz w:val="22"/>
+          <w:szCs w:val="22"/>
+          <w:rFonts w:ascii="Segoe UI Emoji" w:cs="Segoe UI Emoji" w:eastAsia="Segoe UI Emoji" w:hAnsi="Segoe UI Emoji"/>
         </w:rPr>
         <w:t xml:space="preserve">⚙️  </w:t>
       </w:r>
       <w:r>
         <w:rPr>
-          <w:rFonts w:ascii="Arial" w:cs="Arial" w:eastAsia="Arial" w:hAnsi="Arial"/>
           <w:color w:val="111827"/>
           <w:sz w:val="22"/>
           <w:szCs w:val="22"/>
+          <w:rFonts w:ascii="Arial" w:cs="Arial" w:eastAsia="Arial" w:hAnsi="Arial"/>
         </w:rPr>
         <w:t xml:space="preserve">Automatischer Versand: In den E-Mail-Einstellungen konfigurieren (siehe C3)</w:t>
       </w:r>
     </w:p>
     <w:p>
       <w:pPr>
-        <w:spacing w:after="30" w:before="30"/>
+        <w:spacing w:before="30" w:after="30"/>
         <w:ind w:left="200"/>
       </w:pPr>
       <w:r>
         <w:rPr>
-          <w:rFonts w:ascii="Segoe UI Emoji" w:cs="Segoe UI Emoji" w:eastAsia="Segoe UI Emoji" w:hAnsi="Segoe UI Emoji"/>
-          <w:sz w:val="22"/>
-          <w:szCs w:val="22"/>
+          <w:sz w:val="22"/>
+          <w:szCs w:val="22"/>
+          <w:rFonts w:ascii="Segoe UI Emoji" w:cs="Segoe UI Emoji" w:eastAsia="Segoe UI Emoji" w:hAnsi="Segoe UI Emoji"/>
         </w:rPr>
         <w:t xml:space="preserve">📁  </w:t>
       </w:r>
       <w:r>
         <w:rPr>
-          <w:rFonts w:ascii="Arial" w:cs="Arial" w:eastAsia="Arial" w:hAnsi="Arial"/>
           <w:color w:val="111827"/>
           <w:sz w:val="22"/>
           <w:szCs w:val="22"/>
+          <w:rFonts w:ascii="Arial" w:cs="Arial" w:eastAsia="Arial" w:hAnsi="Arial"/>
         </w:rPr>
         <w:t xml:space="preserve">Archiv: Alle Berichte werden automatisch im Jahresarchiv gespeichert</w:t>
       </w:r>
@@ -2266,25 +2264,25 @@
     <w:p>
       <w:pPr>
         <w:shd w:color="2d5aa0" w:val="solid"/>
-        <w:spacing w:after="40" w:before="160"/>
+        <w:spacing w:before="160" w:after="40"/>
         <w:ind w:left="160" w:right="160"/>
       </w:pPr>
       <w:r>
         <w:rPr>
-          <w:rFonts w:ascii="Segoe UI Emoji" w:cs="Segoe UI Emoji" w:eastAsia="Segoe UI Emoji" w:hAnsi="Segoe UI Emoji"/>
           <w:sz w:val="26"/>
           <w:szCs w:val="26"/>
+          <w:rFonts w:ascii="Segoe UI Emoji" w:cs="Segoe UI Emoji" w:eastAsia="Segoe UI Emoji" w:hAnsi="Segoe UI Emoji"/>
         </w:rPr>
         <w:t xml:space="preserve">🗄️  </w:t>
       </w:r>
       <w:r>
         <w:rPr>
-          <w:rFonts w:ascii="Arial" w:cs="Arial" w:eastAsia="Arial" w:hAnsi="Arial"/>
           <w:b/>
           <w:bCs/>
           <w:color w:val="FFFFFF"/>
           <w:sz w:val="26"/>
           <w:szCs w:val="26"/>
+          <w:rFonts w:ascii="Arial" w:cs="Arial" w:eastAsia="Arial" w:hAnsi="Arial"/>
         </w:rPr>
         <w:t xml:space="preserve">B6  Jahresarchiv</w:t>
       </w:r>
@@ -2299,69 +2297,69 @@
     </w:p>
     <w:p>
       <w:pPr>
-        <w:spacing w:after="30" w:before="30"/>
+        <w:spacing w:before="30" w:after="30"/>
         <w:ind w:left="200"/>
       </w:pPr>
       <w:r>
         <w:rPr>
-          <w:rFonts w:ascii="Segoe UI Emoji" w:cs="Segoe UI Emoji" w:eastAsia="Segoe UI Emoji" w:hAnsi="Segoe UI Emoji"/>
-          <w:sz w:val="22"/>
-          <w:szCs w:val="22"/>
+          <w:sz w:val="22"/>
+          <w:szCs w:val="22"/>
+          <w:rFonts w:ascii="Segoe UI Emoji" w:cs="Segoe UI Emoji" w:eastAsia="Segoe UI Emoji" w:hAnsi="Segoe UI Emoji"/>
         </w:rPr>
         <w:t xml:space="preserve">📅  </w:t>
       </w:r>
       <w:r>
         <w:rPr>
-          <w:rFonts w:ascii="Arial" w:cs="Arial" w:eastAsia="Arial" w:hAnsi="Arial"/>
           <w:color w:val="111827"/>
           <w:sz w:val="22"/>
           <w:szCs w:val="22"/>
+          <w:rFonts w:ascii="Arial" w:cs="Arial" w:eastAsia="Arial" w:hAnsi="Arial"/>
         </w:rPr>
         <w:t xml:space="preserve">Abgeschlossene Monate werden automatisch archiviert</w:t>
       </w:r>
     </w:p>
     <w:p>
       <w:pPr>
-        <w:spacing w:after="30" w:before="30"/>
+        <w:spacing w:before="30" w:after="30"/>
         <w:ind w:left="200"/>
       </w:pPr>
       <w:r>
         <w:rPr>
-          <w:rFonts w:ascii="Segoe UI Emoji" w:cs="Segoe UI Emoji" w:eastAsia="Segoe UI Emoji" w:hAnsi="Segoe UI Emoji"/>
-          <w:sz w:val="22"/>
-          <w:szCs w:val="22"/>
+          <w:sz w:val="22"/>
+          <w:szCs w:val="22"/>
+          <w:rFonts w:ascii="Segoe UI Emoji" w:cs="Segoe UI Emoji" w:eastAsia="Segoe UI Emoji" w:hAnsi="Segoe UI Emoji"/>
         </w:rPr>
         <w:t xml:space="preserve">🔒  </w:t>
       </w:r>
       <w:r>
         <w:rPr>
-          <w:rFonts w:ascii="Arial" w:cs="Arial" w:eastAsia="Arial" w:hAnsi="Arial"/>
           <w:color w:val="111827"/>
           <w:sz w:val="22"/>
           <w:szCs w:val="22"/>
+          <w:rFonts w:ascii="Arial" w:cs="Arial" w:eastAsia="Arial" w:hAnsi="Arial"/>
         </w:rPr>
         <w:t xml:space="preserve">Archivierte Einträge sind lesbar, aber nicht mehr veränderbar</w:t>
       </w:r>
     </w:p>
     <w:p>
       <w:pPr>
-        <w:spacing w:after="30" w:before="30"/>
+        <w:spacing w:before="30" w:after="30"/>
         <w:ind w:left="200"/>
       </w:pPr>
       <w:r>
         <w:rPr>
-          <w:rFonts w:ascii="Segoe UI Emoji" w:cs="Segoe UI Emoji" w:eastAsia="Segoe UI Emoji" w:hAnsi="Segoe UI Emoji"/>
-          <w:sz w:val="22"/>
-          <w:szCs w:val="22"/>
+          <w:sz w:val="22"/>
+          <w:szCs w:val="22"/>
+          <w:rFonts w:ascii="Segoe UI Emoji" w:cs="Segoe UI Emoji" w:eastAsia="Segoe UI Emoji" w:hAnsi="Segoe UI Emoji"/>
         </w:rPr>
         <w:t xml:space="preserve">🖨️  </w:t>
       </w:r>
       <w:r>
         <w:rPr>
-          <w:rFonts w:ascii="Arial" w:cs="Arial" w:eastAsia="Arial" w:hAnsi="Arial"/>
           <w:color w:val="111827"/>
           <w:sz w:val="22"/>
           <w:szCs w:val="22"/>
+          <w:rFonts w:ascii="Arial" w:cs="Arial" w:eastAsia="Arial" w:hAnsi="Arial"/>
         </w:rPr>
         <w:t xml:space="preserve">Druck für Behörden: Archiv → Monat wählen → PDF/Drucken</w:t>
       </w:r>
@@ -2394,23 +2392,23 @@
           </w:tcPr>
           <w:p>
             <w:pPr>
-              <w:spacing w:after="60" w:before="60"/>
+              <w:spacing w:before="60" w:after="60"/>
               <w:ind w:left="80"/>
             </w:pPr>
             <w:r>
               <w:rPr>
-                <w:rFonts w:ascii="Segoe UI Emoji" w:cs="Segoe UI Emoji" w:eastAsia="Segoe UI Emoji" w:hAnsi="Segoe UI Emoji"/>
                 <w:sz w:val="22"/>
                 <w:szCs w:val="22"/>
+                <w:rFonts w:ascii="Segoe UI Emoji" w:cs="Segoe UI Emoji" w:eastAsia="Segoe UI Emoji" w:hAnsi="Segoe UI Emoji"/>
               </w:rPr>
               <w:t xml:space="preserve">✅  </w:t>
             </w:r>
             <w:r>
               <w:rPr>
-                <w:rFonts w:ascii="Arial" w:cs="Arial" w:eastAsia="Arial" w:hAnsi="Arial"/>
                 <w:color w:val="111827"/>
                 <w:sz w:val="21"/>
                 <w:szCs w:val="21"/>
+                <w:rFonts w:ascii="Arial" w:cs="Arial" w:eastAsia="Arial" w:hAnsi="Arial"/>
               </w:rPr>
               <w:t xml:space="preserve">Bei Behördenprüfungen: Jahresarchiv öffnen → gewünschten Monat wählen → «Drucken». Fertig! 📋</w:t>
             </w:r>
@@ -2437,25 +2435,25 @@
           <w:bottom w:val="single" w:color="2d5aa0" w:sz="6"/>
         </w:pBdr>
         <w:shd w:color="1a3a6b" w:val="solid"/>
-        <w:spacing w:after="0" w:before="200"/>
+        <w:spacing w:before="200" w:after="0"/>
         <w:ind w:left="200" w:right="200"/>
       </w:pPr>
       <w:r>
         <w:rPr>
-          <w:rFonts w:ascii="Segoe UI Emoji" w:cs="Segoe UI Emoji" w:eastAsia="Segoe UI Emoji" w:hAnsi="Segoe UI Emoji"/>
           <w:sz w:val="32"/>
           <w:szCs w:val="32"/>
+          <w:rFonts w:ascii="Segoe UI Emoji" w:cs="Segoe UI Emoji" w:eastAsia="Segoe UI Emoji" w:hAnsi="Segoe UI Emoji"/>
         </w:rPr>
         <w:t xml:space="preserve">⚙️  </w:t>
       </w:r>
       <w:r>
         <w:rPr>
-          <w:rFonts w:ascii="Arial" w:cs="Arial" w:eastAsia="Arial" w:hAnsi="Arial"/>
           <w:b/>
           <w:bCs/>
           <w:color w:val="FFFFFF"/>
           <w:sz w:val="32"/>
           <w:szCs w:val="32"/>
+          <w:rFonts w:ascii="Arial" w:cs="Arial" w:eastAsia="Arial" w:hAnsi="Arial"/>
         </w:rPr>
         <w:t xml:space="preserve">Teil C  –  Systemadministration</w:t>
       </w:r>
@@ -2496,23 +2494,23 @@
           </w:tcPr>
           <w:p>
             <w:pPr>
-              <w:spacing w:after="60" w:before="60"/>
+              <w:spacing w:before="60" w:after="60"/>
               <w:ind w:left="80"/>
             </w:pPr>
             <w:r>
               <w:rPr>
-                <w:rFonts w:ascii="Segoe UI Emoji" w:cs="Segoe UI Emoji" w:eastAsia="Segoe UI Emoji" w:hAnsi="Segoe UI Emoji"/>
                 <w:sz w:val="22"/>
                 <w:szCs w:val="22"/>
+                <w:rFonts w:ascii="Segoe UI Emoji" w:cs="Segoe UI Emoji" w:eastAsia="Segoe UI Emoji" w:hAnsi="Segoe UI Emoji"/>
               </w:rPr>
               <w:t xml:space="preserve">🚨  </w:t>
             </w:r>
             <w:r>
               <w:rPr>
-                <w:rFonts w:ascii="Arial" w:cs="Arial" w:eastAsia="Arial" w:hAnsi="Arial"/>
                 <w:color w:val="111827"/>
                 <w:sz w:val="21"/>
                 <w:szCs w:val="21"/>
+                <w:rFonts w:ascii="Arial" w:cs="Arial" w:eastAsia="Arial" w:hAnsi="Arial"/>
               </w:rPr>
               <w:t xml:space="preserve">Dieser Bereich ist nur für Admins! Falsche Einstellungen können den Betrieb stören. Im Zweifel erst fragen.</w:t>
             </w:r>
@@ -2531,25 +2529,25 @@
     <w:p>
       <w:pPr>
         <w:shd w:color="2d5aa0" w:val="solid"/>
-        <w:spacing w:after="40" w:before="160"/>
+        <w:spacing w:before="160" w:after="40"/>
         <w:ind w:left="160" w:right="160"/>
       </w:pPr>
       <w:r>
         <w:rPr>
-          <w:rFonts w:ascii="Segoe UI Emoji" w:cs="Segoe UI Emoji" w:eastAsia="Segoe UI Emoji" w:hAnsi="Segoe UI Emoji"/>
           <w:sz w:val="26"/>
           <w:szCs w:val="26"/>
+          <w:rFonts w:ascii="Segoe UI Emoji" w:cs="Segoe UI Emoji" w:eastAsia="Segoe UI Emoji" w:hAnsi="Segoe UI Emoji"/>
         </w:rPr>
         <w:t xml:space="preserve">🔐  </w:t>
       </w:r>
       <w:r>
         <w:rPr>
-          <w:rFonts w:ascii="Arial" w:cs="Arial" w:eastAsia="Arial" w:hAnsi="Arial"/>
           <w:b/>
           <w:bCs/>
           <w:color w:val="FFFFFF"/>
           <w:sz w:val="26"/>
           <w:szCs w:val="26"/>
+          <w:rFonts w:ascii="Arial" w:cs="Arial" w:eastAsia="Arial" w:hAnsi="Arial"/>
         </w:rPr>
         <w:t xml:space="preserve">C1  Benutzerverwaltung &amp; Rollen</w:t>
       </w:r>
@@ -2597,12 +2595,12 @@
             </w:pPr>
             <w:r>
               <w:rPr>
-                <w:rFonts w:ascii="Arial" w:cs="Arial" w:eastAsia="Arial" w:hAnsi="Arial"/>
                 <w:b/>
                 <w:bCs/>
                 <w:color w:val="FFFFFF"/>
                 <w:sz w:val="20"/>
                 <w:szCs w:val="20"/>
+                <w:rFonts w:ascii="Arial" w:cs="Arial" w:eastAsia="Arial" w:hAnsi="Arial"/>
               </w:rPr>
               <w:t xml:space="preserve">Rolle</w:t>
             </w:r>
@@ -2625,12 +2623,12 @@
             </w:pPr>
             <w:r>
               <w:rPr>
-                <w:rFonts w:ascii="Arial" w:cs="Arial" w:eastAsia="Arial" w:hAnsi="Arial"/>
                 <w:b/>
                 <w:bCs/>
                 <w:color w:val="FFFFFF"/>
                 <w:sz w:val="20"/>
                 <w:szCs w:val="20"/>
+                <w:rFonts w:ascii="Arial" w:cs="Arial" w:eastAsia="Arial" w:hAnsi="Arial"/>
               </w:rPr>
               <w:t xml:space="preserve">Kann...</w:t>
             </w:r>
@@ -2653,12 +2651,12 @@
             </w:pPr>
             <w:r>
               <w:rPr>
-                <w:rFonts w:ascii="Arial" w:cs="Arial" w:eastAsia="Arial" w:hAnsi="Arial"/>
                 <w:b/>
                 <w:bCs/>
                 <w:color w:val="FFFFFF"/>
                 <w:sz w:val="20"/>
                 <w:szCs w:val="20"/>
+                <w:rFonts w:ascii="Arial" w:cs="Arial" w:eastAsia="Arial" w:hAnsi="Arial"/>
               </w:rPr>
               <w:t xml:space="preserve">Darf NICHT...</w:t>
             </w:r>
@@ -2678,15 +2676,15 @@
           </w:tcPr>
           <w:p>
             <w:pPr>
-              <w:spacing w:after="60" w:before="60"/>
+              <w:spacing w:before="60" w:after="60"/>
               <w:ind w:left="80"/>
             </w:pPr>
             <w:r>
               <w:rPr>
-                <w:rFonts w:ascii="Segoe UI Emoji" w:cs="Segoe UI Emoji" w:eastAsia="Segoe UI Emoji" w:hAnsi="Segoe UI Emoji"/>
                 <w:color w:val="111827"/>
                 <w:sz w:val="19"/>
                 <w:szCs w:val="19"/>
+                <w:rFonts w:ascii="Segoe UI Emoji" w:cs="Segoe UI Emoji" w:eastAsia="Segoe UI Emoji" w:hAnsi="Segoe UI Emoji"/>
               </w:rPr>
               <w:t xml:space="preserve">👤  Mitarbeiter</w:t>
             </w:r>
@@ -2704,15 +2702,15 @@
           </w:tcPr>
           <w:p>
             <w:pPr>
-              <w:spacing w:after="60" w:before="60"/>
+              <w:spacing w:before="60" w:after="60"/>
               <w:ind w:left="80"/>
             </w:pPr>
             <w:r>
               <w:rPr>
-                <w:rFonts w:ascii="Arial" w:cs="Arial" w:eastAsia="Arial" w:hAnsi="Arial"/>
                 <w:color w:val="111827"/>
                 <w:sz w:val="19"/>
                 <w:szCs w:val="19"/>
+                <w:rFonts w:ascii="Arial" w:cs="Arial" w:eastAsia="Arial" w:hAnsi="Arial"/>
               </w:rPr>
               <w:t xml:space="preserve">Einträge lesen &amp; erstellen, eigene Tageseinträge</w:t>
             </w:r>
@@ -2730,15 +2728,15 @@
           </w:tcPr>
           <w:p>
             <w:pPr>
-              <w:spacing w:after="60" w:before="60"/>
+              <w:spacing w:before="60" w:after="60"/>
               <w:ind w:left="80"/>
             </w:pPr>
             <w:r>
               <w:rPr>
-                <w:rFonts w:ascii="Arial" w:cs="Arial" w:eastAsia="Arial" w:hAnsi="Arial"/>
                 <w:color w:val="111827"/>
                 <w:sz w:val="19"/>
                 <w:szCs w:val="19"/>
+                <w:rFonts w:ascii="Arial" w:cs="Arial" w:eastAsia="Arial" w:hAnsi="Arial"/>
               </w:rPr>
               <w:t xml:space="preserve">Systemeinstellungen, andere Mitarbeiter verwalten</w:t>
             </w:r>
@@ -2758,15 +2756,15 @@
           </w:tcPr>
           <w:p>
             <w:pPr>
-              <w:spacing w:after="60" w:before="60"/>
+              <w:spacing w:before="60" w:after="60"/>
               <w:ind w:left="80"/>
             </w:pPr>
             <w:r>
               <w:rPr>
-                <w:rFonts w:ascii="Segoe UI Emoji" w:cs="Segoe UI Emoji" w:eastAsia="Segoe UI Emoji" w:hAnsi="Segoe UI Emoji"/>
                 <w:color w:val="111827"/>
                 <w:sz w:val="19"/>
                 <w:szCs w:val="19"/>
+                <w:rFonts w:ascii="Segoe UI Emoji" w:cs="Segoe UI Emoji" w:eastAsia="Segoe UI Emoji" w:hAnsi="Segoe UI Emoji"/>
               </w:rPr>
               <w:t xml:space="preserve">👔  Verwaltung</w:t>
             </w:r>
@@ -2784,15 +2782,15 @@
           </w:tcPr>
           <w:p>
             <w:pPr>
-              <w:spacing w:after="60" w:before="60"/>
+              <w:spacing w:before="60" w:after="60"/>
               <w:ind w:left="80"/>
             </w:pPr>
             <w:r>
               <w:rPr>
-                <w:rFonts w:ascii="Arial" w:cs="Arial" w:eastAsia="Arial" w:hAnsi="Arial"/>
                 <w:color w:val="111827"/>
                 <w:sz w:val="19"/>
                 <w:szCs w:val="19"/>
+                <w:rFonts w:ascii="Arial" w:cs="Arial" w:eastAsia="Arial" w:hAnsi="Arial"/>
               </w:rPr>
               <w:t xml:space="preserve">Alles + Lieferanten, Schulungen, Berichte, Archiv</w:t>
             </w:r>
@@ -2810,15 +2808,15 @@
           </w:tcPr>
           <w:p>
             <w:pPr>
-              <w:spacing w:after="60" w:before="60"/>
+              <w:spacing w:before="60" w:after="60"/>
               <w:ind w:left="80"/>
             </w:pPr>
             <w:r>
               <w:rPr>
-                <w:rFonts w:ascii="Arial" w:cs="Arial" w:eastAsia="Arial" w:hAnsi="Arial"/>
                 <w:color w:val="111827"/>
                 <w:sz w:val="19"/>
                 <w:szCs w:val="19"/>
+                <w:rFonts w:ascii="Arial" w:cs="Arial" w:eastAsia="Arial" w:hAnsi="Arial"/>
               </w:rPr>
               <w:t xml:space="preserve">Benutzerverwaltung, System-Konfiguration</w:t>
             </w:r>
@@ -2838,15 +2836,15 @@
           </w:tcPr>
           <w:p>
             <w:pPr>
-              <w:spacing w:after="60" w:before="60"/>
+              <w:spacing w:before="60" w:after="60"/>
               <w:ind w:left="80"/>
             </w:pPr>
             <w:r>
               <w:rPr>
-                <w:rFonts w:ascii="Segoe UI Emoji" w:cs="Segoe UI Emoji" w:eastAsia="Segoe UI Emoji" w:hAnsi="Segoe UI Emoji"/>
                 <w:color w:val="111827"/>
                 <w:sz w:val="19"/>
                 <w:szCs w:val="19"/>
+                <w:rFonts w:ascii="Segoe UI Emoji" w:cs="Segoe UI Emoji" w:eastAsia="Segoe UI Emoji" w:hAnsi="Segoe UI Emoji"/>
               </w:rPr>
               <w:t xml:space="preserve">🔧  Admin</w:t>
             </w:r>
@@ -2864,15 +2862,15 @@
           </w:tcPr>
           <w:p>
             <w:pPr>
-              <w:spacing w:after="60" w:before="60"/>
+              <w:spacing w:before="60" w:after="60"/>
               <w:ind w:left="80"/>
             </w:pPr>
             <w:r>
               <w:rPr>
-                <w:rFonts w:ascii="Arial" w:cs="Arial" w:eastAsia="Arial" w:hAnsi="Arial"/>
                 <w:color w:val="111827"/>
                 <w:sz w:val="19"/>
                 <w:szCs w:val="19"/>
+                <w:rFonts w:ascii="Arial" w:cs="Arial" w:eastAsia="Arial" w:hAnsi="Arial"/>
               </w:rPr>
               <w:t xml:space="preserve">Vollzugriff: Alles im System</w:t>
             </w:r>
@@ -2890,15 +2888,15 @@
           </w:tcPr>
           <w:p>
             <w:pPr>
-              <w:spacing w:after="60" w:before="60"/>
+              <w:spacing w:before="60" w:after="60"/>
               <w:ind w:left="80"/>
             </w:pPr>
             <w:r>
               <w:rPr>
-                <w:rFonts w:ascii="Arial" w:cs="Arial" w:eastAsia="Arial" w:hAnsi="Arial"/>
                 <w:color w:val="111827"/>
                 <w:sz w:val="19"/>
                 <w:szCs w:val="19"/>
+                <w:rFonts w:ascii="Arial" w:cs="Arial" w:eastAsia="Arial" w:hAnsi="Arial"/>
               </w:rPr>
               <w:t xml:space="preserve">–</w:t>
             </w:r>
@@ -2917,25 +2915,25 @@
     <w:p>
       <w:pPr>
         <w:shd w:color="2d5aa0" w:val="solid"/>
-        <w:spacing w:after="40" w:before="160"/>
+        <w:spacing w:before="160" w:after="40"/>
         <w:ind w:left="160" w:right="160"/>
       </w:pPr>
       <w:r>
         <w:rPr>
-          <w:rFonts w:ascii="Segoe UI Emoji" w:cs="Segoe UI Emoji" w:eastAsia="Segoe UI Emoji" w:hAnsi="Segoe UI Emoji"/>
           <w:sz w:val="26"/>
           <w:szCs w:val="26"/>
+          <w:rFonts w:ascii="Segoe UI Emoji" w:cs="Segoe UI Emoji" w:eastAsia="Segoe UI Emoji" w:hAnsi="Segoe UI Emoji"/>
         </w:rPr>
         <w:t xml:space="preserve">👁️  </w:t>
       </w:r>
       <w:r>
         <w:rPr>
-          <w:rFonts w:ascii="Arial" w:cs="Arial" w:eastAsia="Arial" w:hAnsi="Arial"/>
           <w:b/>
           <w:bCs/>
           <w:color w:val="FFFFFF"/>
           <w:sz w:val="26"/>
           <w:szCs w:val="26"/>
+          <w:rFonts w:ascii="Arial" w:cs="Arial" w:eastAsia="Arial" w:hAnsi="Arial"/>
         </w:rPr>
         <w:t xml:space="preserve">C2  Module &amp; Sichtbarkeit</w:t>
       </w:r>
@@ -2950,12 +2948,11 @@
     </w:p>
     <w:p>
       <w:pPr>
-        <w:spacing w:after="20" w:before="20"/>
+        <w:spacing w:before="20" w:after="20"/>
         <w:jc w:val="left"/>
       </w:pPr>
       <w:r>
         <w:rPr>
-          <w:rFonts w:ascii="Arial" w:cs="Arial" w:eastAsia="Arial" w:hAnsi="Arial"/>
           <w:b w:val="false"/>
           <w:bCs w:val="false"/>
           <w:i w:val="false"/>
@@ -2963,6 +2960,7 @@
           <w:color w:val="111827"/>
           <w:sz w:val="22"/>
           <w:szCs w:val="22"/>
+          <w:rFonts w:ascii="Arial" w:cs="Arial" w:eastAsia="Arial" w:hAnsi="Arial"/>
         </w:rPr>
         <w:t xml:space="preserve">Pfad: Admin-Menü → Sektionssichtbarkeit</w:t>
       </w:r>
@@ -2977,69 +2975,69 @@
     </w:p>
     <w:p>
       <w:pPr>
-        <w:spacing w:after="30" w:before="30"/>
+        <w:spacing w:before="30" w:after="30"/>
         <w:ind w:left="200"/>
       </w:pPr>
       <w:r>
         <w:rPr>
-          <w:rFonts w:ascii="Segoe UI Emoji" w:cs="Segoe UI Emoji" w:eastAsia="Segoe UI Emoji" w:hAnsi="Segoe UI Emoji"/>
-          <w:sz w:val="22"/>
-          <w:szCs w:val="22"/>
+          <w:sz w:val="22"/>
+          <w:szCs w:val="22"/>
+          <w:rFonts w:ascii="Segoe UI Emoji" w:cs="Segoe UI Emoji" w:eastAsia="Segoe UI Emoji" w:hAnsi="Segoe UI Emoji"/>
         </w:rPr>
         <w:t xml:space="preserve">✅  </w:t>
       </w:r>
       <w:r>
         <w:rPr>
-          <w:rFonts w:ascii="Arial" w:cs="Arial" w:eastAsia="Arial" w:hAnsi="Arial"/>
           <w:color w:val="111827"/>
           <w:sz w:val="22"/>
           <w:szCs w:val="22"/>
+          <w:rFonts w:ascii="Arial" w:cs="Arial" w:eastAsia="Arial" w:hAnsi="Arial"/>
         </w:rPr>
         <w:t xml:space="preserve">Bereiche ein-/ausblenden: Pro Markt einzeln konfigurierbar</w:t>
       </w:r>
     </w:p>
     <w:p>
       <w:pPr>
-        <w:spacing w:after="30" w:before="30"/>
+        <w:spacing w:before="30" w:after="30"/>
         <w:ind w:left="200"/>
       </w:pPr>
       <w:r>
         <w:rPr>
-          <w:rFonts w:ascii="Segoe UI Emoji" w:cs="Segoe UI Emoji" w:eastAsia="Segoe UI Emoji" w:hAnsi="Segoe UI Emoji"/>
-          <w:sz w:val="22"/>
-          <w:szCs w:val="22"/>
+          <w:sz w:val="22"/>
+          <w:szCs w:val="22"/>
+          <w:rFonts w:ascii="Segoe UI Emoji" w:cs="Segoe UI Emoji" w:eastAsia="Segoe UI Emoji" w:hAnsi="Segoe UI Emoji"/>
         </w:rPr>
         <w:t xml:space="preserve">💡  </w:t>
       </w:r>
       <w:r>
         <w:rPr>
-          <w:rFonts w:ascii="Arial" w:cs="Arial" w:eastAsia="Arial" w:hAnsi="Arial"/>
           <w:color w:val="111827"/>
           <w:sz w:val="22"/>
           <w:szCs w:val="22"/>
+          <w:rFonts w:ascii="Arial" w:cs="Arial" w:eastAsia="Arial" w:hAnsi="Arial"/>
         </w:rPr>
         <w:t xml:space="preserve">Nützlich wenn z.B. die Metzgerei-Bereiche in einem Markt nicht gebraucht werden</w:t>
       </w:r>
     </w:p>
     <w:p>
       <w:pPr>
-        <w:spacing w:after="30" w:before="30"/>
+        <w:spacing w:before="30" w:after="30"/>
         <w:ind w:left="200"/>
       </w:pPr>
       <w:r>
         <w:rPr>
-          <w:rFonts w:ascii="Segoe UI Emoji" w:cs="Segoe UI Emoji" w:eastAsia="Segoe UI Emoji" w:hAnsi="Segoe UI Emoji"/>
-          <w:sz w:val="22"/>
-          <w:szCs w:val="22"/>
+          <w:sz w:val="22"/>
+          <w:szCs w:val="22"/>
+          <w:rFonts w:ascii="Segoe UI Emoji" w:cs="Segoe UI Emoji" w:eastAsia="Segoe UI Emoji" w:hAnsi="Segoe UI Emoji"/>
         </w:rPr>
         <w:t xml:space="preserve">⚡  </w:t>
       </w:r>
       <w:r>
         <w:rPr>
-          <w:rFonts w:ascii="Arial" w:cs="Arial" w:eastAsia="Arial" w:hAnsi="Arial"/>
           <w:color w:val="111827"/>
           <w:sz w:val="22"/>
           <w:szCs w:val="22"/>
+          <w:rFonts w:ascii="Arial" w:cs="Arial" w:eastAsia="Arial" w:hAnsi="Arial"/>
         </w:rPr>
         <w:t xml:space="preserve">Änderungen wirken sofort – keine Abmeldung nötig</w:t>
       </w:r>
@@ -3080,23 +3078,23 @@
           </w:tcPr>
           <w:p>
             <w:pPr>
-              <w:spacing w:after="60" w:before="60"/>
+              <w:spacing w:before="60" w:after="60"/>
               <w:ind w:left="80"/>
             </w:pPr>
             <w:r>
               <w:rPr>
-                <w:rFonts w:ascii="Segoe UI Emoji" w:cs="Segoe UI Emoji" w:eastAsia="Segoe UI Emoji" w:hAnsi="Segoe UI Emoji"/>
                 <w:sz w:val="22"/>
                 <w:szCs w:val="22"/>
+                <w:rFonts w:ascii="Segoe UI Emoji" w:cs="Segoe UI Emoji" w:eastAsia="Segoe UI Emoji" w:hAnsi="Segoe UI Emoji"/>
               </w:rPr>
               <w:t xml:space="preserve">✅  </w:t>
             </w:r>
             <w:r>
               <w:rPr>
-                <w:rFonts w:ascii="Arial" w:cs="Arial" w:eastAsia="Arial" w:hAnsi="Arial"/>
                 <w:color w:val="111827"/>
                 <w:sz w:val="21"/>
                 <w:szCs w:val="21"/>
+                <w:rFonts w:ascii="Arial" w:cs="Arial" w:eastAsia="Arial" w:hAnsi="Arial"/>
               </w:rPr>
               <w:t xml:space="preserve">Ausgeblendete Bereiche sind nicht weg – sie können jederzeit wieder eingeschaltet werden. Keine Daten gehen verloren.</w:t>
             </w:r>
@@ -3115,25 +3113,25 @@
     <w:p>
       <w:pPr>
         <w:shd w:color="2d5aa0" w:val="solid"/>
-        <w:spacing w:after="40" w:before="160"/>
+        <w:spacing w:before="160" w:after="40"/>
         <w:ind w:left="160" w:right="160"/>
       </w:pPr>
       <w:r>
         <w:rPr>
-          <w:rFonts w:ascii="Segoe UI Emoji" w:cs="Segoe UI Emoji" w:eastAsia="Segoe UI Emoji" w:hAnsi="Segoe UI Emoji"/>
           <w:sz w:val="26"/>
           <w:szCs w:val="26"/>
+          <w:rFonts w:ascii="Segoe UI Emoji" w:cs="Segoe UI Emoji" w:eastAsia="Segoe UI Emoji" w:hAnsi="Segoe UI Emoji"/>
         </w:rPr>
         <w:t xml:space="preserve">📧  </w:t>
       </w:r>
       <w:r>
         <w:rPr>
-          <w:rFonts w:ascii="Arial" w:cs="Arial" w:eastAsia="Arial" w:hAnsi="Arial"/>
           <w:b/>
           <w:bCs/>
           <w:color w:val="FFFFFF"/>
           <w:sz w:val="26"/>
           <w:szCs w:val="26"/>
+          <w:rFonts w:ascii="Arial" w:cs="Arial" w:eastAsia="Arial" w:hAnsi="Arial"/>
         </w:rPr>
         <w:t xml:space="preserve">C3  E-Mail-Einstellungen</w:t>
       </w:r>
@@ -3148,12 +3146,11 @@
     </w:p>
     <w:p>
       <w:pPr>
-        <w:spacing w:after="20" w:before="20"/>
+        <w:spacing w:before="20" w:after="20"/>
         <w:jc w:val="left"/>
       </w:pPr>
       <w:r>
         <w:rPr>
-          <w:rFonts w:ascii="Arial" w:cs="Arial" w:eastAsia="Arial" w:hAnsi="Arial"/>
           <w:b w:val="false"/>
           <w:bCs w:val="false"/>
           <w:i w:val="false"/>
@@ -3161,6 +3158,7 @@
           <w:color w:val="111827"/>
           <w:sz w:val="22"/>
           <w:szCs w:val="22"/>
+          <w:rFonts w:ascii="Arial" w:cs="Arial" w:eastAsia="Arial" w:hAnsi="Arial"/>
         </w:rPr>
         <w:t xml:space="preserve">Pfad: Admin-Menü → E-Mail-Einstellungen</w:t>
       </w:r>
@@ -3175,14 +3173,14 @@
     </w:p>
     <w:p>
       <w:pPr>
-        <w:spacing w:after="20" w:before="80"/>
-      </w:pPr>
-      <w:r>
-        <w:rPr>
-          <w:rFonts w:ascii="Arial" w:cs="Arial" w:eastAsia="Arial" w:hAnsi="Arial"/>
+        <w:spacing w:before="80" w:after="20"/>
+      </w:pPr>
+      <w:r>
+        <w:rPr>
           <w:color w:val="6b7280"/>
           <w:sz w:val="18"/>
           <w:szCs w:val="18"/>
+          <w:rFonts w:ascii="Arial" w:cs="Arial" w:eastAsia="Arial" w:hAnsi="Arial"/>
         </w:rPr>
         <w:t xml:space="preserve">So sieht's aus:</w:t>
       </w:r>
@@ -3216,26 +3214,26 @@
           </w:tcPr>
           <w:p>
             <w:pPr>
-              <w:spacing w:after="40" w:before="40"/>
+              <w:spacing w:before="40" w:after="40"/>
               <w:ind w:left="80"/>
             </w:pPr>
             <w:r>
               <w:rPr>
-                <w:rFonts w:ascii="Courier New" w:cs="Courier New" w:eastAsia="Courier New" w:hAnsi="Courier New"/>
                 <w:color w:val="ef4444"/>
                 <w:sz w:val="16"/>
                 <w:szCs w:val="16"/>
+                <w:rFonts w:ascii="Courier New" w:cs="Courier New" w:eastAsia="Courier New" w:hAnsi="Courier New"/>
               </w:rPr>
               <w:t xml:space="preserve">●  ●  ●  </w:t>
             </w:r>
             <w:r>
               <w:rPr>
-                <w:rFonts w:ascii="Arial" w:cs="Arial" w:eastAsia="Arial" w:hAnsi="Arial"/>
                 <w:b/>
                 <w:bCs/>
                 <w:color w:val="FFFFFF"/>
                 <w:sz w:val="18"/>
                 <w:szCs w:val="18"/>
+                <w:rFonts w:ascii="Arial" w:cs="Arial" w:eastAsia="Arial" w:hAnsi="Arial"/>
               </w:rPr>
               <w:t xml:space="preserve">MiKa – E-Mail-Einstellungen</w:t>
             </w:r>
@@ -3256,17 +3254,17 @@
           <w:p>
             <w:pPr>
               <w:shd w:color="eef4fb" w:val="solid"/>
-              <w:spacing w:after="30" w:before="30"/>
+              <w:spacing w:before="30" w:after="30"/>
               <w:ind w:left="120" w:right="120"/>
             </w:pPr>
             <w:r>
               <w:rPr>
-                <w:rFonts w:ascii="Arial" w:cs="Arial" w:eastAsia="Arial" w:hAnsi="Arial"/>
                 <w:b/>
                 <w:bCs/>
                 <w:color w:val="111827"/>
                 <w:sz w:val="19"/>
                 <w:szCs w:val="19"/>
+                <w:rFonts w:ascii="Arial" w:cs="Arial" w:eastAsia="Arial" w:hAnsi="Arial"/>
               </w:rPr>
               <w:t xml:space="preserve">📧  E-Mail-Einstellungen</w:t>
             </w:r>
@@ -3286,17 +3284,17 @@
           </w:tcPr>
           <w:p>
             <w:pPr>
-              <w:spacing w:after="30" w:before="30"/>
+              <w:spacing w:before="30" w:after="30"/>
               <w:ind w:left="120" w:right="120"/>
             </w:pPr>
             <w:r>
               <w:rPr>
-                <w:rFonts w:ascii="Arial" w:cs="Arial" w:eastAsia="Arial" w:hAnsi="Arial"/>
                 <w:b w:val="false"/>
                 <w:bCs w:val="false"/>
                 <w:color w:val="111827"/>
                 <w:sz w:val="19"/>
                 <w:szCs w:val="19"/>
+                <w:rFonts w:ascii="Arial" w:cs="Arial" w:eastAsia="Arial" w:hAnsi="Arial"/>
               </w:rPr>
               <w:t xml:space="preserve">  SMTP-Server:      mail.edeka-dallmann.de</w:t>
             </w:r>
@@ -3316,17 +3314,17 @@
           </w:tcPr>
           <w:p>
             <w:pPr>
-              <w:spacing w:after="30" w:before="30"/>
+              <w:spacing w:before="30" w:after="30"/>
               <w:ind w:left="120" w:right="120"/>
             </w:pPr>
             <w:r>
               <w:rPr>
-                <w:rFonts w:ascii="Arial" w:cs="Arial" w:eastAsia="Arial" w:hAnsi="Arial"/>
                 <w:b w:val="false"/>
                 <w:bCs w:val="false"/>
                 <w:color w:val="111827"/>
                 <w:sz w:val="19"/>
                 <w:szCs w:val="19"/>
+                <w:rFonts w:ascii="Arial" w:cs="Arial" w:eastAsia="Arial" w:hAnsi="Arial"/>
               </w:rPr>
               <w:t xml:space="preserve">  SMTP-Port:        587  (TLS)</w:t>
             </w:r>
@@ -3346,17 +3344,17 @@
           </w:tcPr>
           <w:p>
             <w:pPr>
-              <w:spacing w:after="30" w:before="30"/>
+              <w:spacing w:before="30" w:after="30"/>
               <w:ind w:left="120" w:right="120"/>
             </w:pPr>
             <w:r>
               <w:rPr>
-                <w:rFonts w:ascii="Arial" w:cs="Arial" w:eastAsia="Arial" w:hAnsi="Arial"/>
                 <w:b w:val="false"/>
                 <w:bCs w:val="false"/>
                 <w:color w:val="111827"/>
                 <w:sz w:val="19"/>
                 <w:szCs w:val="19"/>
+                <w:rFonts w:ascii="Arial" w:cs="Arial" w:eastAsia="Arial" w:hAnsi="Arial"/>
               </w:rPr>
               <w:t xml:space="preserve">  Absender:         mika@edeka-dallmann.de</w:t>
             </w:r>
@@ -3376,17 +3374,17 @@
           </w:tcPr>
           <w:p>
             <w:pPr>
-              <w:spacing w:after="30" w:before="30"/>
+              <w:spacing w:before="30" w:after="30"/>
               <w:ind w:left="120" w:right="120"/>
             </w:pPr>
             <w:r>
               <w:rPr>
-                <w:rFonts w:ascii="Arial" w:cs="Arial" w:eastAsia="Arial" w:hAnsi="Arial"/>
                 <w:b w:val="false"/>
                 <w:bCs w:val="false"/>
                 <w:color w:val="111827"/>
                 <w:sz w:val="19"/>
                 <w:szCs w:val="19"/>
+                <w:rFonts w:ascii="Arial" w:cs="Arial" w:eastAsia="Arial" w:hAnsi="Arial"/>
               </w:rPr>
               <w:t xml:space="preserve">  Empfänger:        verwaltung@edeka-dallmann.de</w:t>
             </w:r>
@@ -3406,17 +3404,17 @@
           </w:tcPr>
           <w:p>
             <w:pPr>
-              <w:spacing w:after="30" w:before="30"/>
+              <w:spacing w:before="30" w:after="30"/>
               <w:ind w:left="120" w:right="120"/>
             </w:pPr>
             <w:r>
               <w:rPr>
-                <w:rFonts w:ascii="Arial" w:cs="Arial" w:eastAsia="Arial" w:hAnsi="Arial"/>
                 <w:b w:val="false"/>
                 <w:bCs w:val="false"/>
                 <w:color w:val="111827"/>
                 <w:sz w:val="19"/>
                 <w:szCs w:val="19"/>
+                <w:rFonts w:ascii="Arial" w:cs="Arial" w:eastAsia="Arial" w:hAnsi="Arial"/>
               </w:rPr>
               <w:t xml:space="preserve">  ✅ Automatischer Monatsbericht-Versand (1. des Monats, 06:00 Uhr)</w:t>
             </w:r>
@@ -3436,17 +3434,17 @@
           </w:tcPr>
           <w:p>
             <w:pPr>
-              <w:spacing w:after="30" w:before="30"/>
+              <w:spacing w:before="30" w:after="30"/>
               <w:ind w:left="120" w:right="120"/>
             </w:pPr>
             <w:r>
               <w:rPr>
-                <w:rFonts w:ascii="Arial" w:cs="Arial" w:eastAsia="Arial" w:hAnsi="Arial"/>
                 <w:b w:val="false"/>
                 <w:bCs w:val="false"/>
                 <w:color w:val="2d5aa0"/>
                 <w:sz w:val="19"/>
                 <w:szCs w:val="19"/>
+                <w:rFonts w:ascii="Arial" w:cs="Arial" w:eastAsia="Arial" w:hAnsi="Arial"/>
               </w:rPr>
               <w:t xml:space="preserve">                          [💾 Speichern]    [📧 Testmail senden]</w:t>
             </w:r>
@@ -3463,74 +3461,73 @@
           <w:sz w:val="10"/>
           <w:szCs w:val="10"/>
         </w:rPr>
-        <w:t xml:space="preserve"/>
-      </w:r>
-    </w:p>
-    <w:p>
-      <w:pPr>
-        <w:spacing w:after="30" w:before="30"/>
+      </w:r>
+    </w:p>
+    <w:p>
+      <w:pPr>
+        <w:spacing w:before="30" w:after="30"/>
         <w:ind w:left="200"/>
       </w:pPr>
       <w:r>
         <w:rPr>
-          <w:rFonts w:ascii="Segoe UI Emoji" w:cs="Segoe UI Emoji" w:eastAsia="Segoe UI Emoji" w:hAnsi="Segoe UI Emoji"/>
-          <w:sz w:val="22"/>
-          <w:szCs w:val="22"/>
+          <w:sz w:val="22"/>
+          <w:szCs w:val="22"/>
+          <w:rFonts w:ascii="Segoe UI Emoji" w:cs="Segoe UI Emoji" w:eastAsia="Segoe UI Emoji" w:hAnsi="Segoe UI Emoji"/>
         </w:rPr>
         <w:t xml:space="preserve">🔑  </w:t>
       </w:r>
       <w:r>
         <w:rPr>
-          <w:rFonts w:ascii="Arial" w:cs="Arial" w:eastAsia="Arial" w:hAnsi="Arial"/>
           <w:color w:val="111827"/>
           <w:sz w:val="22"/>
           <w:szCs w:val="22"/>
+          <w:rFonts w:ascii="Arial" w:cs="Arial" w:eastAsia="Arial" w:hAnsi="Arial"/>
         </w:rPr>
         <w:t xml:space="preserve">SMTP-Zugangsdaten und Empfänger eintragen</w:t>
       </w:r>
     </w:p>
     <w:p>
       <w:pPr>
-        <w:spacing w:after="30" w:before="30"/>
+        <w:spacing w:before="30" w:after="30"/>
         <w:ind w:left="200"/>
       </w:pPr>
       <w:r>
         <w:rPr>
-          <w:rFonts w:ascii="Segoe UI Emoji" w:cs="Segoe UI Emoji" w:eastAsia="Segoe UI Emoji" w:hAnsi="Segoe UI Emoji"/>
-          <w:sz w:val="22"/>
-          <w:szCs w:val="22"/>
+          <w:sz w:val="22"/>
+          <w:szCs w:val="22"/>
+          <w:rFonts w:ascii="Segoe UI Emoji" w:cs="Segoe UI Emoji" w:eastAsia="Segoe UI Emoji" w:hAnsi="Segoe UI Emoji"/>
         </w:rPr>
         <w:t xml:space="preserve">📧  </w:t>
       </w:r>
       <w:r>
         <w:rPr>
-          <w:rFonts w:ascii="Arial" w:cs="Arial" w:eastAsia="Arial" w:hAnsi="Arial"/>
           <w:color w:val="111827"/>
           <w:sz w:val="22"/>
           <w:szCs w:val="22"/>
+          <w:rFonts w:ascii="Arial" w:cs="Arial" w:eastAsia="Arial" w:hAnsi="Arial"/>
         </w:rPr>
         <w:t xml:space="preserve">«Testmail senden» prüft die Konfiguration sofort</w:t>
       </w:r>
     </w:p>
     <w:p>
       <w:pPr>
-        <w:spacing w:after="30" w:before="30"/>
+        <w:spacing w:before="30" w:after="30"/>
         <w:ind w:left="200"/>
       </w:pPr>
       <w:r>
         <w:rPr>
-          <w:rFonts w:ascii="Segoe UI Emoji" w:cs="Segoe UI Emoji" w:eastAsia="Segoe UI Emoji" w:hAnsi="Segoe UI Emoji"/>
-          <w:sz w:val="22"/>
-          <w:szCs w:val="22"/>
+          <w:sz w:val="22"/>
+          <w:szCs w:val="22"/>
+          <w:rFonts w:ascii="Segoe UI Emoji" w:cs="Segoe UI Emoji" w:eastAsia="Segoe UI Emoji" w:hAnsi="Segoe UI Emoji"/>
         </w:rPr>
         <w:t xml:space="preserve">⏰  </w:t>
       </w:r>
       <w:r>
         <w:rPr>
-          <w:rFonts w:ascii="Arial" w:cs="Arial" w:eastAsia="Arial" w:hAnsi="Arial"/>
           <w:color w:val="111827"/>
           <w:sz w:val="22"/>
           <w:szCs w:val="22"/>
+          <w:rFonts w:ascii="Arial" w:cs="Arial" w:eastAsia="Arial" w:hAnsi="Arial"/>
         </w:rPr>
         <w:t xml:space="preserve">Automatischer Versand: täglich 06:00 Uhr zum Monatswechsel</w:t>
       </w:r>
@@ -3546,25 +3543,25 @@
     <w:p>
       <w:pPr>
         <w:shd w:color="2d5aa0" w:val="solid"/>
-        <w:spacing w:after="40" w:before="160"/>
+        <w:spacing w:before="160" w:after="40"/>
         <w:ind w:left="160" w:right="160"/>
       </w:pPr>
       <w:r>
         <w:rPr>
-          <w:rFonts w:ascii="Segoe UI Emoji" w:cs="Segoe UI Emoji" w:eastAsia="Segoe UI Emoji" w:hAnsi="Segoe UI Emoji"/>
           <w:sz w:val="26"/>
           <w:szCs w:val="26"/>
+          <w:rFonts w:ascii="Segoe UI Emoji" w:cs="Segoe UI Emoji" w:eastAsia="Segoe UI Emoji" w:hAnsi="Segoe UI Emoji"/>
         </w:rPr>
         <w:t xml:space="preserve">🔧  </w:t>
       </w:r>
       <w:r>
         <w:rPr>
-          <w:rFonts w:ascii="Arial" w:cs="Arial" w:eastAsia="Arial" w:hAnsi="Arial"/>
           <w:b/>
           <w:bCs/>
           <w:color w:val="FFFFFF"/>
           <w:sz w:val="26"/>
           <w:szCs w:val="26"/>
+          <w:rFonts w:ascii="Arial" w:cs="Arial" w:eastAsia="Arial" w:hAnsi="Arial"/>
         </w:rPr>
         <w:t xml:space="preserve">C4  Geräteverwaltung &amp; TÜV-Fristen</w:t>
       </w:r>
@@ -3579,12 +3576,11 @@
     </w:p>
     <w:p>
       <w:pPr>
-        <w:spacing w:after="20" w:before="20"/>
+        <w:spacing w:before="20" w:after="20"/>
         <w:jc w:val="left"/>
       </w:pPr>
       <w:r>
         <w:rPr>
-          <w:rFonts w:ascii="Arial" w:cs="Arial" w:eastAsia="Arial" w:hAnsi="Arial"/>
           <w:b w:val="false"/>
           <w:bCs w:val="false"/>
           <w:i w:val="false"/>
@@ -3592,6 +3588,7 @@
           <w:color w:val="111827"/>
           <w:sz w:val="22"/>
           <w:szCs w:val="22"/>
+          <w:rFonts w:ascii="Arial" w:cs="Arial" w:eastAsia="Arial" w:hAnsi="Arial"/>
         </w:rPr>
         <w:t xml:space="preserve">Pfad: Admin-Menü → Geräteverwaltung</w:t>
       </w:r>
@@ -3606,69 +3603,69 @@
     </w:p>
     <w:p>
       <w:pPr>
-        <w:spacing w:after="30" w:before="30"/>
+        <w:spacing w:before="30" w:after="30"/>
         <w:ind w:left="200"/>
       </w:pPr>
       <w:r>
         <w:rPr>
-          <w:rFonts w:ascii="Segoe UI Emoji" w:cs="Segoe UI Emoji" w:eastAsia="Segoe UI Emoji" w:hAnsi="Segoe UI Emoji"/>
-          <w:sz w:val="22"/>
-          <w:szCs w:val="22"/>
+          <w:sz w:val="22"/>
+          <w:szCs w:val="22"/>
+          <w:rFonts w:ascii="Segoe UI Emoji" w:cs="Segoe UI Emoji" w:eastAsia="Segoe UI Emoji" w:hAnsi="Segoe UI Emoji"/>
         </w:rPr>
         <w:t xml:space="preserve">📋  </w:t>
       </w:r>
       <w:r>
         <w:rPr>
-          <w:rFonts w:ascii="Arial" w:cs="Arial" w:eastAsia="Arial" w:hAnsi="Arial"/>
           <w:color w:val="111827"/>
           <w:sz w:val="22"/>
           <w:szCs w:val="22"/>
+          <w:rFonts w:ascii="Arial" w:cs="Arial" w:eastAsia="Arial" w:hAnsi="Arial"/>
         </w:rPr>
         <w:t xml:space="preserve">Messgeräte hinterlegen: Thermometer, Waagen, Messgeräte</w:t>
       </w:r>
     </w:p>
     <w:p>
       <w:pPr>
-        <w:spacing w:after="30" w:before="30"/>
+        <w:spacing w:before="30" w:after="30"/>
         <w:ind w:left="200"/>
       </w:pPr>
       <w:r>
         <w:rPr>
-          <w:rFonts w:ascii="Segoe UI Emoji" w:cs="Segoe UI Emoji" w:eastAsia="Segoe UI Emoji" w:hAnsi="Segoe UI Emoji"/>
-          <w:sz w:val="22"/>
-          <w:szCs w:val="22"/>
+          <w:sz w:val="22"/>
+          <w:szCs w:val="22"/>
+          <w:rFonts w:ascii="Segoe UI Emoji" w:cs="Segoe UI Emoji" w:eastAsia="Segoe UI Emoji" w:hAnsi="Segoe UI Emoji"/>
         </w:rPr>
         <w:t xml:space="preserve">📅  </w:t>
       </w:r>
       <w:r>
         <w:rPr>
-          <w:rFonts w:ascii="Arial" w:cs="Arial" w:eastAsia="Arial" w:hAnsi="Arial"/>
           <w:color w:val="111827"/>
           <w:sz w:val="22"/>
           <w:szCs w:val="22"/>
+          <w:rFonts w:ascii="Arial" w:cs="Arial" w:eastAsia="Arial" w:hAnsi="Arial"/>
         </w:rPr>
         <w:t xml:space="preserve">Kalibrierungsdaten und nächste Wartungstermine eintragen</w:t>
       </w:r>
     </w:p>
     <w:p>
       <w:pPr>
-        <w:spacing w:after="30" w:before="30"/>
+        <w:spacing w:before="30" w:after="30"/>
         <w:ind w:left="200"/>
       </w:pPr>
       <w:r>
         <w:rPr>
-          <w:rFonts w:ascii="Segoe UI Emoji" w:cs="Segoe UI Emoji" w:eastAsia="Segoe UI Emoji" w:hAnsi="Segoe UI Emoji"/>
-          <w:sz w:val="22"/>
-          <w:szCs w:val="22"/>
+          <w:sz w:val="22"/>
+          <w:szCs w:val="22"/>
+          <w:rFonts w:ascii="Segoe UI Emoji" w:cs="Segoe UI Emoji" w:eastAsia="Segoe UI Emoji" w:hAnsi="Segoe UI Emoji"/>
         </w:rPr>
         <w:t xml:space="preserve">🔔  </w:t>
       </w:r>
       <w:r>
         <w:rPr>
-          <w:rFonts w:ascii="Arial" w:cs="Arial" w:eastAsia="Arial" w:hAnsi="Arial"/>
           <w:color w:val="111827"/>
           <w:sz w:val="22"/>
           <w:szCs w:val="22"/>
+          <w:rFonts w:ascii="Arial" w:cs="Arial" w:eastAsia="Arial" w:hAnsi="Arial"/>
         </w:rPr>
         <w:t xml:space="preserve">Automatische Erinnerungen wenn Fristen ablaufen (TÜV-Notifier)</w:t>
       </w:r>
@@ -3684,25 +3681,25 @@
     <w:p>
       <w:pPr>
         <w:shd w:color="2d5aa0" w:val="solid"/>
-        <w:spacing w:after="40" w:before="160"/>
+        <w:spacing w:before="160" w:after="40"/>
         <w:ind w:left="160" w:right="160"/>
       </w:pPr>
       <w:r>
         <w:rPr>
-          <w:rFonts w:ascii="Segoe UI Emoji" w:cs="Segoe UI Emoji" w:eastAsia="Segoe UI Emoji" w:hAnsi="Segoe UI Emoji"/>
           <w:sz w:val="26"/>
           <w:szCs w:val="26"/>
+          <w:rFonts w:ascii="Segoe UI Emoji" w:cs="Segoe UI Emoji" w:eastAsia="Segoe UI Emoji" w:hAnsi="Segoe UI Emoji"/>
         </w:rPr>
         <w:t xml:space="preserve">🗑️  </w:t>
       </w:r>
       <w:r>
         <w:rPr>
-          <w:rFonts w:ascii="Arial" w:cs="Arial" w:eastAsia="Arial" w:hAnsi="Arial"/>
           <w:b/>
           <w:bCs/>
           <w:color w:val="FFFFFF"/>
           <w:sz w:val="26"/>
           <w:szCs w:val="26"/>
+          <w:rFonts w:ascii="Arial" w:cs="Arial" w:eastAsia="Arial" w:hAnsi="Arial"/>
         </w:rPr>
         <w:t xml:space="preserve">C5  Datenschutz &amp; Bereinigung</w:t>
       </w:r>
@@ -3717,69 +3714,69 @@
     </w:p>
     <w:p>
       <w:pPr>
-        <w:spacing w:after="30" w:before="30"/>
+        <w:spacing w:before="30" w:after="30"/>
         <w:ind w:left="200"/>
       </w:pPr>
       <w:r>
         <w:rPr>
-          <w:rFonts w:ascii="Segoe UI Emoji" w:cs="Segoe UI Emoji" w:eastAsia="Segoe UI Emoji" w:hAnsi="Segoe UI Emoji"/>
-          <w:sz w:val="22"/>
-          <w:szCs w:val="22"/>
+          <w:sz w:val="22"/>
+          <w:szCs w:val="22"/>
+          <w:rFonts w:ascii="Segoe UI Emoji" w:cs="Segoe UI Emoji" w:eastAsia="Segoe UI Emoji" w:hAnsi="Segoe UI Emoji"/>
         </w:rPr>
         <w:t xml:space="preserve">📅  </w:t>
       </w:r>
       <w:r>
         <w:rPr>
-          <w:rFonts w:ascii="Arial" w:cs="Arial" w:eastAsia="Arial" w:hAnsi="Arial"/>
           <w:color w:val="111827"/>
           <w:sz w:val="22"/>
           <w:szCs w:val="22"/>
+          <w:rFonts w:ascii="Arial" w:cs="Arial" w:eastAsia="Arial" w:hAnsi="Arial"/>
         </w:rPr>
         <w:t xml:space="preserve">Gesetzliche Aufbewahrungsfrist: mindestens 3 Jahre</w:t>
       </w:r>
     </w:p>
     <w:p>
       <w:pPr>
-        <w:spacing w:after="30" w:before="30"/>
+        <w:spacing w:before="30" w:after="30"/>
         <w:ind w:left="200"/>
       </w:pPr>
       <w:r>
         <w:rPr>
-          <w:rFonts w:ascii="Segoe UI Emoji" w:cs="Segoe UI Emoji" w:eastAsia="Segoe UI Emoji" w:hAnsi="Segoe UI Emoji"/>
-          <w:sz w:val="22"/>
-          <w:szCs w:val="22"/>
+          <w:sz w:val="22"/>
+          <w:szCs w:val="22"/>
+          <w:rFonts w:ascii="Segoe UI Emoji" w:cs="Segoe UI Emoji" w:eastAsia="Segoe UI Emoji" w:hAnsi="Segoe UI Emoji"/>
         </w:rPr>
         <w:t xml:space="preserve">📊  </w:t>
       </w:r>
       <w:r>
         <w:rPr>
-          <w:rFonts w:ascii="Arial" w:cs="Arial" w:eastAsia="Arial" w:hAnsi="Arial"/>
           <w:color w:val="111827"/>
           <w:sz w:val="22"/>
           <w:szCs w:val="22"/>
+          <w:rFonts w:ascii="Arial" w:cs="Arial" w:eastAsia="Arial" w:hAnsi="Arial"/>
         </w:rPr>
         <w:t xml:space="preserve">Revisionslog: zeigt wer wann was eingetragen oder geändert hat</w:t>
       </w:r>
     </w:p>
     <w:p>
       <w:pPr>
-        <w:spacing w:after="30" w:before="30"/>
+        <w:spacing w:before="30" w:after="30"/>
         <w:ind w:left="200"/>
       </w:pPr>
       <w:r>
         <w:rPr>
-          <w:rFonts w:ascii="Segoe UI Emoji" w:cs="Segoe UI Emoji" w:eastAsia="Segoe UI Emoji" w:hAnsi="Segoe UI Emoji"/>
-          <w:sz w:val="22"/>
-          <w:szCs w:val="22"/>
+          <w:sz w:val="22"/>
+          <w:szCs w:val="22"/>
+          <w:rFonts w:ascii="Segoe UI Emoji" w:cs="Segoe UI Emoji" w:eastAsia="Segoe UI Emoji" w:hAnsi="Segoe UI Emoji"/>
         </w:rPr>
         <w:t xml:space="preserve">🗑️  </w:t>
       </w:r>
       <w:r>
         <w:rPr>
-          <w:rFonts w:ascii="Arial" w:cs="Arial" w:eastAsia="Arial" w:hAnsi="Arial"/>
           <w:color w:val="111827"/>
           <w:sz w:val="22"/>
           <w:szCs w:val="22"/>
+          <w:rFonts w:ascii="Arial" w:cs="Arial" w:eastAsia="Arial" w:hAnsi="Arial"/>
         </w:rPr>
         <w:t xml:space="preserve">Datenbereinigung: Nur nach Ablauf der Aufbewahrungsfrist</w:t>
       </w:r>
@@ -3820,23 +3817,23 @@
           </w:tcPr>
           <w:p>
             <w:pPr>
-              <w:spacing w:after="60" w:before="60"/>
+              <w:spacing w:before="60" w:after="60"/>
               <w:ind w:left="80"/>
             </w:pPr>
             <w:r>
               <w:rPr>
-                <w:rFonts w:ascii="Segoe UI Emoji" w:cs="Segoe UI Emoji" w:eastAsia="Segoe UI Emoji" w:hAnsi="Segoe UI Emoji"/>
                 <w:sz w:val="22"/>
                 <w:szCs w:val="22"/>
+                <w:rFonts w:ascii="Segoe UI Emoji" w:cs="Segoe UI Emoji" w:eastAsia="Segoe UI Emoji" w:hAnsi="Segoe UI Emoji"/>
               </w:rPr>
               <w:t xml:space="preserve">🚨  </w:t>
             </w:r>
             <w:r>
               <w:rPr>
-                <w:rFonts w:ascii="Arial" w:cs="Arial" w:eastAsia="Arial" w:hAnsi="Arial"/>
                 <w:color w:val="111827"/>
                 <w:sz w:val="21"/>
                 <w:szCs w:val="21"/>
+                <w:rFonts w:ascii="Arial" w:cs="Arial" w:eastAsia="Arial" w:hAnsi="Arial"/>
               </w:rPr>
               <w:t xml:space="preserve">Vor jeder Bereinigung: erst einen PDF-Export aller betroffenen Monate erstellen und sicher speichern!</w:t>
             </w:r>
@@ -3863,25 +3860,25 @@
           <w:bottom w:val="single" w:color="2d5aa0" w:sz="6"/>
         </w:pBdr>
         <w:shd w:color="1a3a6b" w:val="solid"/>
-        <w:spacing w:after="0" w:before="200"/>
+        <w:spacing w:before="200" w:after="0"/>
         <w:ind w:left="200" w:right="200"/>
       </w:pPr>
       <w:r>
         <w:rPr>
-          <w:rFonts w:ascii="Segoe UI Emoji" w:cs="Segoe UI Emoji" w:eastAsia="Segoe UI Emoji" w:hAnsi="Segoe UI Emoji"/>
           <w:sz w:val="32"/>
           <w:szCs w:val="32"/>
+          <w:rFonts w:ascii="Segoe UI Emoji" w:cs="Segoe UI Emoji" w:eastAsia="Segoe UI Emoji" w:hAnsi="Segoe UI Emoji"/>
         </w:rPr>
         <w:t xml:space="preserve">🔒  </w:t>
       </w:r>
       <w:r>
         <w:rPr>
-          <w:rFonts w:ascii="Arial" w:cs="Arial" w:eastAsia="Arial" w:hAnsi="Arial"/>
           <w:b/>
           <w:bCs/>
           <w:color w:val="FFFFFF"/>
           <w:sz w:val="32"/>
           <w:szCs w:val="32"/>
+          <w:rFonts w:ascii="Arial" w:cs="Arial" w:eastAsia="Arial" w:hAnsi="Arial"/>
         </w:rPr>
         <w:t xml:space="preserve">Teil D  –  Wichtige Hinweise &amp; Sicherheit</w:t>
       </w:r>
@@ -3897,25 +3894,25 @@
     <w:p>
       <w:pPr>
         <w:shd w:color="2d5aa0" w:val="solid"/>
-        <w:spacing w:after="40" w:before="160"/>
+        <w:spacing w:before="160" w:after="40"/>
         <w:ind w:left="160" w:right="160"/>
       </w:pPr>
       <w:r>
         <w:rPr>
-          <w:rFonts w:ascii="Segoe UI Emoji" w:cs="Segoe UI Emoji" w:eastAsia="Segoe UI Emoji" w:hAnsi="Segoe UI Emoji"/>
           <w:sz w:val="26"/>
           <w:szCs w:val="26"/>
+          <w:rFonts w:ascii="Segoe UI Emoji" w:cs="Segoe UI Emoji" w:eastAsia="Segoe UI Emoji" w:hAnsi="Segoe UI Emoji"/>
         </w:rPr>
         <w:t xml:space="preserve">🗝️  </w:t>
       </w:r>
       <w:r>
         <w:rPr>
-          <w:rFonts w:ascii="Arial" w:cs="Arial" w:eastAsia="Arial" w:hAnsi="Arial"/>
           <w:b/>
           <w:bCs/>
           <w:color w:val="FFFFFF"/>
           <w:sz w:val="26"/>
           <w:szCs w:val="26"/>
+          <w:rFonts w:ascii="Arial" w:cs="Arial" w:eastAsia="Arial" w:hAnsi="Arial"/>
         </w:rPr>
         <w:t xml:space="preserve">D1  Master-Passwort</w:t>
       </w:r>
@@ -3956,23 +3953,23 @@
           </w:tcPr>
           <w:p>
             <w:pPr>
-              <w:spacing w:after="60" w:before="60"/>
+              <w:spacing w:before="60" w:after="60"/>
               <w:ind w:left="80"/>
             </w:pPr>
             <w:r>
               <w:rPr>
-                <w:rFonts w:ascii="Segoe UI Emoji" w:cs="Segoe UI Emoji" w:eastAsia="Segoe UI Emoji" w:hAnsi="Segoe UI Emoji"/>
                 <w:sz w:val="22"/>
                 <w:szCs w:val="22"/>
+                <w:rFonts w:ascii="Segoe UI Emoji" w:cs="Segoe UI Emoji" w:eastAsia="Segoe UI Emoji" w:hAnsi="Segoe UI Emoji"/>
               </w:rPr>
               <w:t xml:space="preserve">⚠️  </w:t>
             </w:r>
             <w:r>
               <w:rPr>
-                <w:rFonts w:ascii="Arial" w:cs="Arial" w:eastAsia="Arial" w:hAnsi="Arial"/>
                 <w:color w:val="111827"/>
                 <w:sz w:val="21"/>
                 <w:szCs w:val="21"/>
+                <w:rFonts w:ascii="Arial" w:cs="Arial" w:eastAsia="Arial" w:hAnsi="Arial"/>
               </w:rPr>
               <w:t xml:space="preserve">Das Master-Passwort ist der Hauptzugang zur Systemkonfiguration. Nur für Geschäftsleitung/IT bestimmt. Niemals an Mitarbeiter weitergeben!</w:t>
             </w:r>
@@ -3990,46 +3987,46 @@
     </w:p>
     <w:p>
       <w:pPr>
-        <w:spacing w:after="30" w:before="30"/>
+        <w:spacing w:before="30" w:after="30"/>
         <w:ind w:left="200"/>
       </w:pPr>
       <w:r>
         <w:rPr>
-          <w:rFonts w:ascii="Segoe UI Emoji" w:cs="Segoe UI Emoji" w:eastAsia="Segoe UI Emoji" w:hAnsi="Segoe UI Emoji"/>
-          <w:sz w:val="22"/>
-          <w:szCs w:val="22"/>
+          <w:sz w:val="22"/>
+          <w:szCs w:val="22"/>
+          <w:rFonts w:ascii="Segoe UI Emoji" w:cs="Segoe UI Emoji" w:eastAsia="Segoe UI Emoji" w:hAnsi="Segoe UI Emoji"/>
         </w:rPr>
         <w:t xml:space="preserve">🔐  </w:t>
       </w:r>
       <w:r>
         <w:rPr>
-          <w:rFonts w:ascii="Arial" w:cs="Arial" w:eastAsia="Arial" w:hAnsi="Arial"/>
           <w:color w:val="111827"/>
           <w:sz w:val="22"/>
           <w:szCs w:val="22"/>
+          <w:rFonts w:ascii="Arial" w:cs="Arial" w:eastAsia="Arial" w:hAnsi="Arial"/>
         </w:rPr>
         <w:t xml:space="preserve">Wird für administrative Aktionen (z.B. Gerät freischalten) benötigt</w:t>
       </w:r>
     </w:p>
     <w:p>
       <w:pPr>
-        <w:spacing w:after="30" w:before="30"/>
+        <w:spacing w:before="30" w:after="30"/>
         <w:ind w:left="200"/>
       </w:pPr>
       <w:r>
         <w:rPr>
-          <w:rFonts w:ascii="Segoe UI Emoji" w:cs="Segoe UI Emoji" w:eastAsia="Segoe UI Emoji" w:hAnsi="Segoe UI Emoji"/>
-          <w:sz w:val="22"/>
-          <w:szCs w:val="22"/>
+          <w:sz w:val="22"/>
+          <w:szCs w:val="22"/>
+          <w:rFonts w:ascii="Segoe UI Emoji" w:cs="Segoe UI Emoji" w:eastAsia="Segoe UI Emoji" w:hAnsi="Segoe UI Emoji"/>
         </w:rPr>
         <w:t xml:space="preserve">📞  </w:t>
       </w:r>
       <w:r>
         <w:rPr>
-          <w:rFonts w:ascii="Arial" w:cs="Arial" w:eastAsia="Arial" w:hAnsi="Arial"/>
           <w:color w:val="111827"/>
           <w:sz w:val="22"/>
           <w:szCs w:val="22"/>
+          <w:rFonts w:ascii="Arial" w:cs="Arial" w:eastAsia="Arial" w:hAnsi="Arial"/>
         </w:rPr>
         <w:t xml:space="preserve">Bei Verlust: IT-Support kontaktieren</w:t>
       </w:r>
@@ -4045,25 +4042,25 @@
     <w:p>
       <w:pPr>
         <w:shd w:color="2d5aa0" w:val="solid"/>
-        <w:spacing w:after="40" w:before="160"/>
+        <w:spacing w:before="160" w:after="40"/>
         <w:ind w:left="160" w:right="160"/>
       </w:pPr>
       <w:r>
         <w:rPr>
-          <w:rFonts w:ascii="Segoe UI Emoji" w:cs="Segoe UI Emoji" w:eastAsia="Segoe UI Emoji" w:hAnsi="Segoe UI Emoji"/>
           <w:sz w:val="26"/>
           <w:szCs w:val="26"/>
+          <w:rFonts w:ascii="Segoe UI Emoji" w:cs="Segoe UI Emoji" w:eastAsia="Segoe UI Emoji" w:hAnsi="Segoe UI Emoji"/>
         </w:rPr>
         <w:t xml:space="preserve">🚨  </w:t>
       </w:r>
       <w:r>
         <w:rPr>
-          <w:rFonts w:ascii="Arial" w:cs="Arial" w:eastAsia="Arial" w:hAnsi="Arial"/>
           <w:b/>
           <w:bCs/>
           <w:color w:val="FFFFFF"/>
           <w:sz w:val="26"/>
           <w:szCs w:val="26"/>
+          <w:rFonts w:ascii="Arial" w:cs="Arial" w:eastAsia="Arial" w:hAnsi="Arial"/>
         </w:rPr>
         <w:t xml:space="preserve">D2  System-Ausfall – Was tun?</w:t>
       </w:r>
@@ -4106,17 +4103,17 @@
           </w:tcPr>
           <w:p>
             <w:pPr>
-              <w:spacing w:after="60" w:before="60"/>
+              <w:spacing w:before="60" w:after="60"/>
               <w:ind w:left="80"/>
             </w:pPr>
             <w:r>
               <w:rPr>
-                <w:rFonts w:ascii="Arial" w:cs="Arial" w:eastAsia="Arial" w:hAnsi="Arial"/>
                 <w:b/>
                 <w:bCs/>
                 <w:color w:val="1a3a6b"/>
                 <w:sz w:val="20"/>
                 <w:szCs w:val="20"/>
+                <w:rFonts w:ascii="Arial" w:cs="Arial" w:eastAsia="Arial" w:hAnsi="Arial"/>
               </w:rPr>
               <w:t xml:space="preserve">⚡  App lädt nicht</w:t>
             </w:r>
@@ -4135,15 +4132,15 @@
           </w:tcPr>
           <w:p>
             <w:pPr>
-              <w:spacing w:after="60" w:before="60"/>
+              <w:spacing w:before="60" w:after="60"/>
               <w:ind w:left="80"/>
             </w:pPr>
             <w:r>
               <w:rPr>
-                <w:rFonts w:ascii="Arial" w:cs="Arial" w:eastAsia="Arial" w:hAnsi="Arial"/>
                 <w:color w:val="111827"/>
                 <w:sz w:val="20"/>
                 <w:szCs w:val="20"/>
+                <w:rFonts w:ascii="Arial" w:cs="Arial" w:eastAsia="Arial" w:hAnsi="Arial"/>
               </w:rPr>
               <w:t xml:space="preserve">👉  Browser neu laden (F5). Danach 5 Min. warten und nochmal probieren.</w:t>
             </w:r>
@@ -4164,17 +4161,17 @@
           </w:tcPr>
           <w:p>
             <w:pPr>
-              <w:spacing w:after="60" w:before="60"/>
+              <w:spacing w:before="60" w:after="60"/>
               <w:ind w:left="80"/>
             </w:pPr>
             <w:r>
               <w:rPr>
-                <w:rFonts w:ascii="Arial" w:cs="Arial" w:eastAsia="Arial" w:hAnsi="Arial"/>
                 <w:b/>
                 <w:bCs/>
                 <w:color w:val="1a3a6b"/>
                 <w:sz w:val="20"/>
                 <w:szCs w:val="20"/>
+                <w:rFonts w:ascii="Arial" w:cs="Arial" w:eastAsia="Arial" w:hAnsi="Arial"/>
               </w:rPr>
               <w:t xml:space="preserve">⚡  Kein Internet</w:t>
             </w:r>
@@ -4193,15 +4190,15 @@
           </w:tcPr>
           <w:p>
             <w:pPr>
-              <w:spacing w:after="60" w:before="60"/>
+              <w:spacing w:before="60" w:after="60"/>
               <w:ind w:left="80"/>
             </w:pPr>
             <w:r>
               <w:rPr>
-                <w:rFonts w:ascii="Arial" w:cs="Arial" w:eastAsia="Arial" w:hAnsi="Arial"/>
                 <w:color w:val="111827"/>
                 <w:sz w:val="20"/>
                 <w:szCs w:val="20"/>
+                <w:rFonts w:ascii="Arial" w:cs="Arial" w:eastAsia="Arial" w:hAnsi="Arial"/>
               </w:rPr>
               <w:t xml:space="preserve">👉  Einträge auf dem HACCP-Papierbogen machen, nachträglich digital eintragen.</w:t>
             </w:r>
@@ -4222,17 +4219,17 @@
           </w:tcPr>
           <w:p>
             <w:pPr>
-              <w:spacing w:after="60" w:before="60"/>
+              <w:spacing w:before="60" w:after="60"/>
               <w:ind w:left="80"/>
             </w:pPr>
             <w:r>
               <w:rPr>
-                <w:rFonts w:ascii="Arial" w:cs="Arial" w:eastAsia="Arial" w:hAnsi="Arial"/>
                 <w:b/>
                 <w:bCs/>
                 <w:color w:val="1a3a6b"/>
                 <w:sz w:val="20"/>
                 <w:szCs w:val="20"/>
+                <w:rFonts w:ascii="Arial" w:cs="Arial" w:eastAsia="Arial" w:hAnsi="Arial"/>
               </w:rPr>
               <w:t xml:space="preserve">⚡  Daten fehlen</w:t>
             </w:r>
@@ -4251,15 +4248,15 @@
           </w:tcPr>
           <w:p>
             <w:pPr>
-              <w:spacing w:after="60" w:before="60"/>
+              <w:spacing w:before="60" w:after="60"/>
               <w:ind w:left="80"/>
             </w:pPr>
             <w:r>
               <w:rPr>
-                <w:rFonts w:ascii="Arial" w:cs="Arial" w:eastAsia="Arial" w:hAnsi="Arial"/>
                 <w:color w:val="111827"/>
                 <w:sz w:val="20"/>
                 <w:szCs w:val="20"/>
+                <w:rFonts w:ascii="Arial" w:cs="Arial" w:eastAsia="Arial" w:hAnsi="Arial"/>
               </w:rPr>
               <w:t xml:space="preserve">👉  Nicht in der Panik! Daten werden automatisch gesichert. IT-Support anrufen.</w:t>
             </w:r>
@@ -4280,17 +4277,17 @@
           </w:tcPr>
           <w:p>
             <w:pPr>
-              <w:spacing w:after="60" w:before="60"/>
+              <w:spacing w:before="60" w:after="60"/>
               <w:ind w:left="80"/>
             </w:pPr>
             <w:r>
               <w:rPr>
-                <w:rFonts w:ascii="Arial" w:cs="Arial" w:eastAsia="Arial" w:hAnsi="Arial"/>
                 <w:b/>
                 <w:bCs/>
                 <w:color w:val="1a3a6b"/>
                 <w:sz w:val="20"/>
                 <w:szCs w:val="20"/>
+                <w:rFonts w:ascii="Arial" w:cs="Arial" w:eastAsia="Arial" w:hAnsi="Arial"/>
               </w:rPr>
               <w:t xml:space="preserve">⚡  Falscher Eintrag gespeichert</w:t>
             </w:r>
@@ -4309,15 +4306,15 @@
           </w:tcPr>
           <w:p>
             <w:pPr>
-              <w:spacing w:after="60" w:before="60"/>
+              <w:spacing w:before="60" w:after="60"/>
               <w:ind w:left="80"/>
             </w:pPr>
             <w:r>
               <w:rPr>
-                <w:rFonts w:ascii="Arial" w:cs="Arial" w:eastAsia="Arial" w:hAnsi="Arial"/>
                 <w:color w:val="111827"/>
                 <w:sz w:val="20"/>
                 <w:szCs w:val="20"/>
+                <w:rFonts w:ascii="Arial" w:cs="Arial" w:eastAsia="Arial" w:hAnsi="Arial"/>
               </w:rPr>
               <w:t xml:space="preserve">👉  Auf «Bearb.» klicken und korrigieren. Im Revisionslog ist alles nachvollziehbar.</w:t>
             </w:r>
@@ -4336,25 +4333,25 @@
     <w:p>
       <w:pPr>
         <w:shd w:color="2d5aa0" w:val="solid"/>
-        <w:spacing w:after="40" w:before="160"/>
+        <w:spacing w:before="160" w:after="40"/>
         <w:ind w:left="160" w:right="160"/>
       </w:pPr>
       <w:r>
         <w:rPr>
-          <w:rFonts w:ascii="Segoe UI Emoji" w:cs="Segoe UI Emoji" w:eastAsia="Segoe UI Emoji" w:hAnsi="Segoe UI Emoji"/>
           <w:sz w:val="26"/>
           <w:szCs w:val="26"/>
+          <w:rFonts w:ascii="Segoe UI Emoji" w:cs="Segoe UI Emoji" w:eastAsia="Segoe UI Emoji" w:hAnsi="Segoe UI Emoji"/>
         </w:rPr>
         <w:t xml:space="preserve">🏛️  </w:t>
       </w:r>
       <w:r>
         <w:rPr>
-          <w:rFonts w:ascii="Arial" w:cs="Arial" w:eastAsia="Arial" w:hAnsi="Arial"/>
           <w:b/>
           <w:bCs/>
           <w:color w:val="FFFFFF"/>
           <w:sz w:val="26"/>
           <w:szCs w:val="26"/>
+          <w:rFonts w:ascii="Arial" w:cs="Arial" w:eastAsia="Arial" w:hAnsi="Arial"/>
         </w:rPr>
         <w:t xml:space="preserve">D3  Behördenprüfungen</w:t>
       </w:r>
@@ -4395,23 +4392,23 @@
           </w:tcPr>
           <w:p>
             <w:pPr>
-              <w:spacing w:after="60" w:before="60"/>
+              <w:spacing w:before="60" w:after="60"/>
               <w:ind w:left="80"/>
             </w:pPr>
             <w:r>
               <w:rPr>
-                <w:rFonts w:ascii="Segoe UI Emoji" w:cs="Segoe UI Emoji" w:eastAsia="Segoe UI Emoji" w:hAnsi="Segoe UI Emoji"/>
                 <w:sz w:val="22"/>
                 <w:szCs w:val="22"/>
+                <w:rFonts w:ascii="Segoe UI Emoji" w:cs="Segoe UI Emoji" w:eastAsia="Segoe UI Emoji" w:hAnsi="Segoe UI Emoji"/>
               </w:rPr>
               <w:t xml:space="preserve">✅  </w:t>
             </w:r>
             <w:r>
               <w:rPr>
-                <w:rFonts w:ascii="Arial" w:cs="Arial" w:eastAsia="Arial" w:hAnsi="Arial"/>
                 <w:color w:val="111827"/>
                 <w:sz w:val="21"/>
                 <w:szCs w:val="21"/>
+                <w:rFonts w:ascii="Arial" w:cs="Arial" w:eastAsia="Arial" w:hAnsi="Arial"/>
               </w:rPr>
               <w:t xml:space="preserve">Checkliste für Behördenbesuche:
   ✅ Jahresarchiv → gewünschten Zeitraum öffnen → PDF drucken
@@ -4434,25 +4431,25 @@
     <w:p>
       <w:pPr>
         <w:shd w:color="2d5aa0" w:val="solid"/>
-        <w:spacing w:after="40" w:before="160"/>
+        <w:spacing w:before="160" w:after="40"/>
         <w:ind w:left="160" w:right="160"/>
       </w:pPr>
       <w:r>
         <w:rPr>
-          <w:rFonts w:ascii="Segoe UI Emoji" w:cs="Segoe UI Emoji" w:eastAsia="Segoe UI Emoji" w:hAnsi="Segoe UI Emoji"/>
           <w:sz w:val="26"/>
           <w:szCs w:val="26"/>
+          <w:rFonts w:ascii="Segoe UI Emoji" w:cs="Segoe UI Emoji" w:eastAsia="Segoe UI Emoji" w:hAnsi="Segoe UI Emoji"/>
         </w:rPr>
         <w:t xml:space="preserve">✅  </w:t>
       </w:r>
       <w:r>
         <w:rPr>
-          <w:rFonts w:ascii="Arial" w:cs="Arial" w:eastAsia="Arial" w:hAnsi="Arial"/>
           <w:b/>
           <w:bCs/>
           <w:color w:val="FFFFFF"/>
           <w:sz w:val="26"/>
           <w:szCs w:val="26"/>
+          <w:rFonts w:ascii="Arial" w:cs="Arial" w:eastAsia="Arial" w:hAnsi="Arial"/>
         </w:rPr>
         <w:t xml:space="preserve">D4  Checkliste Monatsabschluss</w:t>
       </w:r>
@@ -4467,12 +4464,11 @@
     </w:p>
     <w:p>
       <w:pPr>
-        <w:spacing w:after="20" w:before="20"/>
+        <w:spacing w:before="20" w:after="20"/>
         <w:jc w:val="left"/>
       </w:pPr>
       <w:r>
         <w:rPr>
-          <w:rFonts w:ascii="Arial" w:cs="Arial" w:eastAsia="Arial" w:hAnsi="Arial"/>
           <w:b/>
           <w:bCs/>
           <w:i w:val="false"/>
@@ -4480,121 +4476,122 @@
           <w:color w:val="111827"/>
           <w:sz w:val="22"/>
           <w:szCs w:val="22"/>
+          <w:rFonts w:ascii="Arial" w:cs="Arial" w:eastAsia="Arial" w:hAnsi="Arial"/>
         </w:rPr>
         <w:t xml:space="preserve">Am Ende jedes Monats empfehlen wir folgende Punkte zu prüfen:</w:t>
       </w:r>
     </w:p>
     <w:p>
       <w:pPr>
-        <w:spacing w:after="30" w:before="30"/>
+        <w:spacing w:before="30" w:after="30"/>
         <w:ind w:left="200"/>
       </w:pPr>
       <w:r>
         <w:rPr>
-          <w:rFonts w:ascii="Segoe UI Emoji" w:cs="Segoe UI Emoji" w:eastAsia="Segoe UI Emoji" w:hAnsi="Segoe UI Emoji"/>
-          <w:sz w:val="22"/>
-          <w:szCs w:val="22"/>
+          <w:sz w:val="22"/>
+          <w:szCs w:val="22"/>
+          <w:rFonts w:ascii="Segoe UI Emoji" w:cs="Segoe UI Emoji" w:eastAsia="Segoe UI Emoji" w:hAnsi="Segoe UI Emoji"/>
         </w:rPr>
         <w:t xml:space="preserve">☑️  </w:t>
       </w:r>
       <w:r>
         <w:rPr>
-          <w:rFonts w:ascii="Arial" w:cs="Arial" w:eastAsia="Arial" w:hAnsi="Arial"/>
           <w:color w:val="111827"/>
           <w:sz w:val="22"/>
           <w:szCs w:val="22"/>
+          <w:rFonts w:ascii="Arial" w:cs="Arial" w:eastAsia="Arial" w:hAnsi="Arial"/>
         </w:rPr>
         <w:t xml:space="preserve">Alle Liefertage haben einen Eintrag (keine roten Tage)</w:t>
       </w:r>
     </w:p>
     <w:p>
       <w:pPr>
-        <w:spacing w:after="30" w:before="30"/>
+        <w:spacing w:before="30" w:after="30"/>
         <w:ind w:left="200"/>
       </w:pPr>
       <w:r>
         <w:rPr>
-          <w:rFonts w:ascii="Segoe UI Emoji" w:cs="Segoe UI Emoji" w:eastAsia="Segoe UI Emoji" w:hAnsi="Segoe UI Emoji"/>
-          <w:sz w:val="22"/>
-          <w:szCs w:val="22"/>
+          <w:sz w:val="22"/>
+          <w:szCs w:val="22"/>
+          <w:rFonts w:ascii="Segoe UI Emoji" w:cs="Segoe UI Emoji" w:eastAsia="Segoe UI Emoji" w:hAnsi="Segoe UI Emoji"/>
         </w:rPr>
         <w:t xml:space="preserve">☑️  </w:t>
       </w:r>
       <w:r>
         <w:rPr>
-          <w:rFonts w:ascii="Arial" w:cs="Arial" w:eastAsia="Arial" w:hAnsi="Arial"/>
           <w:color w:val="111827"/>
           <w:sz w:val="22"/>
           <w:szCs w:val="22"/>
+          <w:rFonts w:ascii="Arial" w:cs="Arial" w:eastAsia="Arial" w:hAnsi="Arial"/>
         </w:rPr>
         <w:t xml:space="preserve">Alle Abweichungen haben eine dokumentierte Maßnahme</w:t>
       </w:r>
     </w:p>
     <w:p>
       <w:pPr>
-        <w:spacing w:after="30" w:before="30"/>
+        <w:spacing w:before="30" w:after="30"/>
         <w:ind w:left="200"/>
       </w:pPr>
       <w:r>
         <w:rPr>
-          <w:rFonts w:ascii="Segoe UI Emoji" w:cs="Segoe UI Emoji" w:eastAsia="Segoe UI Emoji" w:hAnsi="Segoe UI Emoji"/>
-          <w:sz w:val="22"/>
-          <w:szCs w:val="22"/>
+          <w:sz w:val="22"/>
+          <w:szCs w:val="22"/>
+          <w:rFonts w:ascii="Segoe UI Emoji" w:cs="Segoe UI Emoji" w:eastAsia="Segoe UI Emoji" w:hAnsi="Segoe UI Emoji"/>
         </w:rPr>
         <w:t xml:space="preserve">☑️  </w:t>
       </w:r>
       <w:r>
         <w:rPr>
-          <w:rFonts w:ascii="Arial" w:cs="Arial" w:eastAsia="Arial" w:hAnsi="Arial"/>
           <w:color w:val="111827"/>
           <w:sz w:val="22"/>
           <w:szCs w:val="22"/>
+          <w:rFonts w:ascii="Arial" w:cs="Arial" w:eastAsia="Arial" w:hAnsi="Arial"/>
         </w:rPr>
         <w:t xml:space="preserve">Monatsbericht wurde generiert und per E-Mail versendet</w:t>
       </w:r>
     </w:p>
     <w:p>
       <w:pPr>
-        <w:spacing w:after="30" w:before="30"/>
+        <w:spacing w:before="30" w:after="30"/>
         <w:ind w:left="200"/>
       </w:pPr>
       <w:r>
         <w:rPr>
-          <w:rFonts w:ascii="Segoe UI Emoji" w:cs="Segoe UI Emoji" w:eastAsia="Segoe UI Emoji" w:hAnsi="Segoe UI Emoji"/>
-          <w:sz w:val="22"/>
-          <w:szCs w:val="22"/>
+          <w:sz w:val="22"/>
+          <w:szCs w:val="22"/>
+          <w:rFonts w:ascii="Segoe UI Emoji" w:cs="Segoe UI Emoji" w:eastAsia="Segoe UI Emoji" w:hAnsi="Segoe UI Emoji"/>
         </w:rPr>
         <w:t xml:space="preserve">☑️  </w:t>
       </w:r>
       <w:r>
         <w:rPr>
-          <w:rFonts w:ascii="Arial" w:cs="Arial" w:eastAsia="Arial" w:hAnsi="Arial"/>
           <w:color w:val="111827"/>
           <w:sz w:val="22"/>
           <w:szCs w:val="22"/>
+          <w:rFonts w:ascii="Arial" w:cs="Arial" w:eastAsia="Arial" w:hAnsi="Arial"/>
         </w:rPr>
         <w:t xml:space="preserve">Schulungen des Monats eingetragen</w:t>
       </w:r>
     </w:p>
     <w:p>
       <w:pPr>
-        <w:spacing w:after="30" w:before="30"/>
+        <w:spacing w:before="30" w:after="30"/>
         <w:ind w:left="200"/>
       </w:pPr>
       <w:r>
         <w:rPr>
-          <w:rFonts w:ascii="Segoe UI Emoji" w:cs="Segoe UI Emoji" w:eastAsia="Segoe UI Emoji" w:hAnsi="Segoe UI Emoji"/>
-          <w:sz w:val="22"/>
-          <w:szCs w:val="22"/>
+          <w:sz w:val="22"/>
+          <w:szCs w:val="22"/>
+          <w:rFonts w:ascii="Segoe UI Emoji" w:cs="Segoe UI Emoji" w:eastAsia="Segoe UI Emoji" w:hAnsi="Segoe UI Emoji"/>
         </w:rPr>
         <w:t xml:space="preserve">☑️  </w:t>
       </w:r>
       <w:r>
         <w:rPr>
-          <w:rFonts w:ascii="Arial" w:cs="Arial" w:eastAsia="Arial" w:hAnsi="Arial"/>
           <w:color w:val="111827"/>
           <w:sz w:val="22"/>
           <w:szCs w:val="22"/>
+          <w:rFonts w:ascii="Arial" w:cs="Arial" w:eastAsia="Arial" w:hAnsi="Arial"/>
         </w:rPr>
         <w:t xml:space="preserve">Reinigungsplan abgehakt</w:t>
       </w:r>
@@ -4613,10 +4610,10 @@
       </w:pPr>
       <w:r>
         <w:rPr>
-          <w:rFonts w:ascii="Arial" w:cs="Arial" w:eastAsia="Arial" w:hAnsi="Arial"/>
           <w:color w:val="6b7280"/>
           <w:sz w:val="20"/>
           <w:szCs w:val="20"/>
+          <w:rFonts w:ascii="Arial" w:cs="Arial" w:eastAsia="Arial" w:hAnsi="Arial"/>
         </w:rPr>
         <w:t xml:space="preserve">MiKa – EDEKA DALLMANN  ·  Stand: April 2025  ·  Bei Fragen: IT-Support</w:t>
       </w:r>
@@ -4635,43 +4632,6 @@
 <w:comments xmlns:cx="http://schemas.microsoft.com/office/drawing/2014/chartex" xmlns:cx1="http://schemas.microsoft.com/office/drawing/2015/9/8/chartex" xmlns:cx2="http://schemas.microsoft.com/office/drawing/2015/10/21/chartex" xmlns:cx3="http://schemas.microsoft.com/office/drawing/2016/5/9/chartex" xmlns:cx4="http://schemas.microsoft.com/office/drawing/2016/5/10/chartex" xmlns:cx5="http://schemas.microsoft.com/office/drawing/2016/5/11/chartex" xmlns:cx6="http://schemas.microsoft.com/office/drawing/2016/5/12/chartex" xmlns:cx7="http://schemas.microsoft.com/office/drawing/2016/5/13/chartex" xmlns:cx8="http://schemas.microsoft.com/office/drawing/2016/5/14/chartex" xmlns:mc="http://schemas.openxmlformats.org/markup-compatibility/2006" xmlns:aink="http://schemas.microsoft.com/office/drawing/2016/ink" xmlns:am3d="http://schemas.microsoft.com/office/drawing/2017/model3d" xmlns:o="urn:schemas-microsoft-com:office:office" xmlns:r="http://schemas.openxmlformats.org/officeDocument/2006/relationships" xmlns:m="http://schemas.openxmlformats.org/officeDocument/2006/math" xmlns:v="urn:schemas-microsoft-com:vml" xmlns:wp14="http://schemas.microsoft.com/office/word/2010/wordprocessingDrawing" xmlns:wp="http://schemas.openxmlformats.org/drawingml/2006/wordprocessingDrawing" xmlns:w10="urn:schemas-microsoft-com:office:word" xmlns:w="http://schemas.openxmlformats.org/wordprocessingml/2006/main" xmlns:w14="http://schemas.microsoft.com/office/word/2010/wordml" xmlns:w15="http://schemas.microsoft.com/office/word/2012/wordml" xmlns:w16cex="http://schemas.microsoft.com/office/word/2018/wordml/cex" xmlns:w16cid="http://schemas.microsoft.com/office/word/2016/wordml/cid" xmlns:w16="http://schemas.microsoft.com/office/word/2018/wordml" xmlns:w16sdtdh="http://schemas.microsoft.com/office/word/2020/wordml/sdtdatahash" xmlns:w16se="http://schemas.microsoft.com/office/word/2015/wordml/symex" xmlns:wpg="http://schemas.microsoft.com/office/word/2010/wordprocessingGroup" xmlns:wpi="http://schemas.microsoft.com/office/word/2010/wordprocessingInk" xmlns:wne="http://schemas.microsoft.com/office/word/2006/wordml" xmlns:wps="http://schemas.microsoft.com/office/word/2010/wordprocessingShape"/>
 </file>
 
-<file path=word/endnotes.xml><?xml version="1.0" encoding="utf-8"?>
-<w:endnotes xmlns:wpc="http://schemas.microsoft.com/office/word/2010/wordprocessingCanvas" xmlns:mc="http://schemas.openxmlformats.org/markup-compatibility/2006" xmlns:o="urn:schemas-microsoft-com:office:office" xmlns:r="http://schemas.openxmlformats.org/officeDocument/2006/relationships" xmlns:m="http://schemas.openxmlformats.org/officeDocument/2006/math" xmlns:v="urn:schemas-microsoft-com:vml" xmlns:wp14="http://schemas.microsoft.com/office/word/2010/wordprocessingDrawing" xmlns:wp="http://schemas.openxmlformats.org/drawingml/2006/wordprocessingDrawing" xmlns:w10="urn:schemas-microsoft-com:office:word" xmlns:w="http://schemas.openxmlformats.org/wordprocessingml/2006/main" xmlns:w14="http://schemas.microsoft.com/office/word/2010/wordml" xmlns:w15="http://schemas.microsoft.com/office/word/2012/wordml" xmlns:wpg="http://schemas.microsoft.com/office/word/2010/wordprocessingGroup" xmlns:wpi="http://schemas.microsoft.com/office/word/2010/wordprocessingInk" xmlns:wne="http://schemas.microsoft.com/office/word/2006/wordml" xmlns:wps="http://schemas.microsoft.com/office/word/2010/wordprocessingShape" mc:Ignorable="w14 w15 wp14">
-  <w:endnote w:type="separator" w:id="-1">
-    <w:p>
-      <w:pPr>
-        <w:spacing w:after="0" w:line="240" w:lineRule="auto"/>
-      </w:pPr>
-      <w:r>
-        <w:rPr>
-          <w:rStyle w:val="EndnoteReference"/>
-        </w:rPr>
-        <w:endnoteRef/>
-      </w:r>
-      <w:r>
-        <w:separator/>
-      </w:r>
-    </w:p>
-  </w:endnote>
-  <w:endnote w:type="continuationSeparator" w:id="0">
-    <w:p>
-      <w:pPr>
-        <w:spacing w:after="0" w:line="240" w:lineRule="auto"/>
-      </w:pPr>
-      <w:r>
-        <w:rPr>
-          <w:rStyle w:val="EndnoteReference"/>
-        </w:rPr>
-        <w:endnoteRef/>
-      </w:r>
-      <w:r>
-        <w:continuationSeparator/>
-      </w:r>
-    </w:p>
-  </w:endnote>
-</w:endnotes>
-</file>
-
 <file path=word/footnotes.xml><?xml version="1.0" encoding="utf-8"?>
 <w:footnotes xmlns:wpc="http://schemas.microsoft.com/office/word/2010/wordprocessingCanvas" xmlns:mc="http://schemas.openxmlformats.org/markup-compatibility/2006" xmlns:o="urn:schemas-microsoft-com:office:office" xmlns:r="http://schemas.openxmlformats.org/officeDocument/2006/relationships" xmlns:m="http://schemas.openxmlformats.org/officeDocument/2006/math" xmlns:v="urn:schemas-microsoft-com:vml" xmlns:wp14="http://schemas.microsoft.com/office/word/2010/wordprocessingDrawing" xmlns:wp="http://schemas.openxmlformats.org/drawingml/2006/wordprocessingDrawing" xmlns:w10="urn:schemas-microsoft-com:office:word" xmlns:w="http://schemas.openxmlformats.org/wordprocessingml/2006/main" xmlns:w14="http://schemas.microsoft.com/office/word/2010/wordml" xmlns:w15="http://schemas.microsoft.com/office/word/2012/wordml" xmlns:wpg="http://schemas.microsoft.com/office/word/2010/wordprocessingGroup" xmlns:wpi="http://schemas.microsoft.com/office/word/2010/wordprocessingInk" xmlns:wne="http://schemas.microsoft.com/office/word/2006/wordml" xmlns:wps="http://schemas.microsoft.com/office/word/2010/wordprocessingShape" mc:Ignorable="w14 w15 wp14">
   <w:footnote w:type="separator" w:id="-1">
@@ -4711,7 +4671,7 @@
 
 <file path=word/numbering.xml><?xml version="1.0" encoding="utf-8"?>
 <w:numbering xmlns:wpc="http://schemas.microsoft.com/office/word/2010/wordprocessingCanvas" xmlns:mc="http://schemas.openxmlformats.org/markup-compatibility/2006" xmlns:o="urn:schemas-microsoft-com:office:office" xmlns:r="http://schemas.openxmlformats.org/officeDocument/2006/relationships" xmlns:m="http://schemas.openxmlformats.org/officeDocument/2006/math" xmlns:v="urn:schemas-microsoft-com:vml" xmlns:wp14="http://schemas.microsoft.com/office/word/2010/wordprocessingDrawing" xmlns:wp="http://schemas.openxmlformats.org/drawingml/2006/wordprocessingDrawing" xmlns:w10="urn:schemas-microsoft-com:office:word" xmlns:w="http://schemas.openxmlformats.org/wordprocessingml/2006/main" xmlns:w14="http://schemas.microsoft.com/office/word/2010/wordml" xmlns:w15="http://schemas.microsoft.com/office/word/2012/wordml" xmlns:wpg="http://schemas.microsoft.com/office/word/2010/wordprocessingGroup" xmlns:wpi="http://schemas.microsoft.com/office/word/2010/wordprocessingInk" xmlns:wne="http://schemas.microsoft.com/office/word/2006/wordml" xmlns:wps="http://schemas.microsoft.com/office/word/2010/wordprocessingShape" mc:Ignorable="w14 w15 wp14">
-  <w:abstractNum w:abstractNumId="1" w15:restartNumberingAfterBreak="0">
+  <w:abstractNum w:abstractNumId="2" w15:restartNumberingAfterBreak="0">
     <w:multiLevelType w:val="hybridMultilevel"/>
     <w:lvl w:ilvl="0" w15:tentative="1">
       <w:start w:val="1"/>
@@ -4796,7 +4756,7 @@
     </w:lvl>
   </w:abstractNum>
   <w:num w:numId="1">
-    <w:abstractNumId w:val="1"/>
+    <w:abstractNumId w:val="2"/>
     <w:lvlOverride w:ilvl="0">
       <w:startOverride w:val="1"/>
     </w:lvlOverride>
@@ -4903,8 +4863,8 @@
     <w:uiPriority w:val="99"/>
     <w:unhideWhenUsed/>
     <w:rPr>
+      <w:u w:val="single"/>
       <w:color w:val="0563C1"/>
-      <w:u w:val="single"/>
     </w:rPr>
   </w:style>
   <w:style w:type="character" w:styleId="FootnoteReference">
@@ -4944,42 +4904,5 @@
       <w:szCs w:val="20"/>
     </w:rPr>
   </w:style>
-  <w:style w:type="character" w:styleId="EndnoteReference">
-    <w:name w:val="endnote reference"/>
-    <w:basedOn w:val="DefaultParagraphFont"/>
-    <w:uiPriority w:val="99"/>
-    <w:semiHidden/>
-    <w:unhideWhenUsed/>
-    <w:rPr>
-      <w:vertAlign w:val="superscript"/>
-    </w:rPr>
-  </w:style>
-  <w:style w:type="paragraph" w:styleId="EndnoteText">
-    <w:name w:val="endnote text"/>
-    <w:basedOn w:val="Normal"/>
-    <w:link w:val="EndnoteTextChar"/>
-    <w:uiPriority w:val="99"/>
-    <w:semiHidden/>
-    <w:unhideWhenUsed/>
-    <w:pPr>
-      <w:spacing w:after="0" w:line="240" w:lineRule="auto"/>
-    </w:pPr>
-    <w:rPr>
-      <w:sz w:val="20"/>
-      <w:szCs w:val="20"/>
-    </w:rPr>
-  </w:style>
-  <w:style w:type="character" w:styleId="EndnoteTextChar">
-    <w:name w:val="Endnote Text Char"/>
-    <w:basedOn w:val="DefaultParagraphFont"/>
-    <w:link w:val="EndnoteText"/>
-    <w:uiPriority w:val="99"/>
-    <w:semiHidden/>
-    <w:unhideWhenUsed/>
-    <w:rPr>
-      <w:sz w:val="20"/>
-      <w:szCs w:val="20"/>
-    </w:rPr>
-  </w:style>
 </w:styles>
 </file>
</xml_diff>